<commit_message>
fix: close remaining Living Evidence review gaps
</commit_message>
<xml_diff>
--- a/public/resume/Anthony_James_Padavano_CV.docx
+++ b/public/resume/Anthony_James_Padavano_CV.docx
@@ -36,7 +36,7 @@
           <w:rPr>
             <w:rStyle w:val="Hyperlink"/>
           </w:rPr>
-          <w:t xml:space="preserve">‘</w:t>
+          <w:t xml:space="preserve"/>
         </w:r>
         <w:r>
           <w:rPr>
@@ -48,7 +48,7 @@
           <w:rPr>
             <w:rStyle w:val="Hyperlink"/>
           </w:rPr>
-          <w:t xml:space="preserve">’</w:t>
+          <w:t xml:space="preserve"/>
         </w:r>
         <w:r>
           <w:rPr>
@@ -89,31 +89,31 @@
           <w:rPr>
             <w:rStyle w:val="Hyperlink"/>
           </w:rPr>
-          <w:t xml:space="preserve">[HttpUrl(</w:t>
+          <w:t xml:space="preserve">https://</w:t>
         </w:r>
         <w:r>
           <w:rPr>
             <w:rStyle w:val="Hyperlink"/>
           </w:rPr>
-          <w:t xml:space="preserve">‘</w:t>
+          <w:t xml:space="preserve"/>
         </w:r>
         <w:r>
           <w:rPr>
             <w:rStyle w:val="Hyperlink"/>
           </w:rPr>
-          <w:t xml:space="preserve">4444j99.github.ioportfolio</w:t>
+          <w:t xml:space="preserve">organvm-vii-kerygma.github.io/portfolio</w:t>
         </w:r>
         <w:r>
           <w:rPr>
             <w:rStyle w:val="Hyperlink"/>
           </w:rPr>
-          <w:t xml:space="preserve">’</w:t>
+          <w:t xml:space="preserve"/>
         </w:r>
         <w:r>
           <w:rPr>
             <w:rStyle w:val="Hyperlink"/>
           </w:rPr>
-          <w:t xml:space="preserve">)]</w:t>
+          <w:t xml:space="preserve"/>
         </w:r>
       </w:hyperlink>
     </w:p>

</xml_diff>

<commit_message>
fix: repair canonical resume artifacts
</commit_message>
<xml_diff>
--- a/public/resume/Anthony_James_Padavano_CV.docx
+++ b/public/resume/Anthony_James_Padavano_CV.docx
@@ -13,11 +13,11 @@
     </w:p>
     <w:p>
       <w:pPr>
+        <w:pStyle w:val="Compact"/>
         <w:numPr>
           <w:ilvl w:val="0"/>
           <w:numId w:val="1001"/>
         </w:numPr>
-        <w:pStyle w:val="Compact"/>
       </w:pPr>
       <w:r>
         <w:t xml:space="preserve">Email:</w:t>
@@ -26,57 +26,33 @@
         <w:t xml:space="preserve"> </w:t>
       </w:r>
       <w:hyperlink r:id="rId20">
-        <w:r>
-          <w:rPr>
-            <w:rStyle w:val="Hyperlink"/>
-          </w:rPr>
-          <w:t xml:space="preserve">[</w:t>
-        </w:r>
-        <w:r>
-          <w:rPr>
-            <w:rStyle w:val="Hyperlink"/>
-          </w:rPr>
-          <w:t xml:space="preserve">‘</w:t>
-        </w:r>
         <w:r>
           <w:rPr>
             <w:rStyle w:val="Hyperlink"/>
           </w:rPr>
           <w:t xml:space="preserve">padavano.anthony@gmail.com</w:t>
         </w:r>
-        <w:r>
-          <w:rPr>
-            <w:rStyle w:val="Hyperlink"/>
-          </w:rPr>
-          <w:t xml:space="preserve">’</w:t>
-        </w:r>
-        <w:r>
-          <w:rPr>
-            <w:rStyle w:val="Hyperlink"/>
-          </w:rPr>
-          <w:t xml:space="preserve">]</w:t>
-        </w:r>
       </w:hyperlink>
     </w:p>
     <w:p>
       <w:pPr>
+        <w:pStyle w:val="Compact"/>
         <w:numPr>
           <w:ilvl w:val="0"/>
           <w:numId w:val="1001"/>
         </w:numPr>
+      </w:pPr>
+      <w:r>
+        <w:t xml:space="preserve">Location: New York City</w:t>
+      </w:r>
+    </w:p>
+    <w:p>
+      <w:pPr>
         <w:pStyle w:val="Compact"/>
-      </w:pPr>
-      <w:r>
-        <w:t xml:space="preserve">Location: New York City</w:t>
-      </w:r>
-    </w:p>
-    <w:p>
-      <w:pPr>
         <w:numPr>
           <w:ilvl w:val="0"/>
           <w:numId w:val="1001"/>
         </w:numPr>
-        <w:pStyle w:val="Compact"/>
       </w:pPr>
       <w:r>
         <w:t xml:space="preserve">Website:</w:t>
@@ -89,41 +65,17 @@
           <w:rPr>
             <w:rStyle w:val="Hyperlink"/>
           </w:rPr>
-          <w:t xml:space="preserve">[HttpUrl(</w:t>
-        </w:r>
-        <w:r>
-          <w:rPr>
-            <w:rStyle w:val="Hyperlink"/>
-          </w:rPr>
-          <w:t xml:space="preserve">‘</w:t>
-        </w:r>
-        <w:r>
-          <w:rPr>
-            <w:rStyle w:val="Hyperlink"/>
-          </w:rPr>
-          <w:t xml:space="preserve">organvm-vii-kerygma.github.ioportfolio</w:t>
-        </w:r>
-        <w:r>
-          <w:rPr>
-            <w:rStyle w:val="Hyperlink"/>
-          </w:rPr>
-          <w:t xml:space="preserve">’</w:t>
-        </w:r>
-        <w:r>
-          <w:rPr>
-            <w:rStyle w:val="Hyperlink"/>
-          </w:rPr>
-          <w:t xml:space="preserve">)]</w:t>
+          <w:t xml:space="preserve">https://organvm-vii-kerygma.github.io/portfolio/</w:t>
         </w:r>
       </w:hyperlink>
     </w:p>
     <w:p>
       <w:pPr>
+        <w:pStyle w:val="Compact"/>
         <w:numPr>
           <w:ilvl w:val="0"/>
           <w:numId w:val="1001"/>
         </w:numPr>
-        <w:pStyle w:val="Compact"/>
       </w:pPr>
       <w:r>
         <w:t xml:space="preserve">GitHub:</w:t>
@@ -155,7 +107,7 @@
         <w:pStyle w:val="FirstParagraph"/>
       </w:pPr>
       <w:r>
-        <w:t xml:space="preserve">Creative Multimedia Specialist with 10+ years of experience in viral multimedia storytelling, marketing strategy, and content lifecycle management. Achieved +17.5M views and contributed to $2M in fundraising and revenue across 15 client campaigns (2011–2024). Skilled in cross-platform strategies, UI/UX design, and campaign optimization, driving audience growth by 35% and ROI by 325%. Proven leader in team collaboration and data-driven performance enhancements, delivering innovative solutions that combine creativity and measurable results.</w:t>
+        <w:t xml:space="preserve">I build production systems that solve expensive problems — not demos, but live platforms that are tested, deployed, and running. Backend and platform engineer with a testing-first discipline: I own systems end-to-end across data, infrastructure, AI, and deployment. Sole architect of a 309-repository system across 8 GitHub organizations governed by a self-healing CI/CD fleet. Meta-certified Full-Stack Developer with 12+ years shipping software, infrastructure, and content at scale. Python and TypeScript, end to end.</w:t>
       </w:r>
     </w:p>
     <w:bookmarkEnd w:id="24"/>
@@ -174,16 +126,34 @@
       </w:pPr>
       <w:r>
         <w:rPr>
+          <w:b/>
           <w:bCs/>
+        </w:rPr>
+        <w:t xml:space="preserve">Backend:</w:t>
+      </w:r>
+      <w:r>
+        <w:t xml:space="preserve"> </w:t>
+      </w:r>
+      <w:r>
+        <w:t xml:space="preserve">Python, FastAPI, Fastify, Express, Node.js, PostgreSQL, Redis, REST APIs, event-driven services</w:t>
+      </w:r>
+    </w:p>
+    <w:p>
+      <w:pPr>
+        <w:pStyle w:val="BodyText"/>
+      </w:pPr>
+      <w:r>
+        <w:rPr>
           <w:b/>
+          <w:bCs/>
         </w:rPr>
-        <w:t xml:space="preserve">Storytelling &amp; Content:</w:t>
+        <w:t xml:space="preserve">Infrastructure:</w:t>
       </w:r>
       <w:r>
         <w:t xml:space="preserve"> </w:t>
       </w:r>
       <w:r>
-        <w:t xml:space="preserve">Storytelling, content creation, video production, audio production, visual campaigns, content lifecycle management</w:t>
+        <w:t xml:space="preserve">Docker, Terraform (AWS — multi-AZ RDS, ElastiCache, S3), GitHub Actions CI/CD, Cloudflare Workers, Nginx, GCP</w:t>
       </w:r>
     </w:p>
     <w:p>
@@ -192,16 +162,34 @@
       </w:pPr>
       <w:r>
         <w:rPr>
+          <w:b/>
           <w:bCs/>
+        </w:rPr>
+        <w:t xml:space="preserve">AI / ML:</w:t>
+      </w:r>
+      <w:r>
+        <w:t xml:space="preserve"> </w:t>
+      </w:r>
+      <w:r>
+        <w:t xml:space="preserve">Multi-agent orchestration, Claude Agent SDK, LLM pipelines, model-agnostic (Anthropic/OpenAI/Ollama), vector search (ChromaDB)</w:t>
+      </w:r>
+    </w:p>
+    <w:p>
+      <w:pPr>
+        <w:pStyle w:val="BodyText"/>
+      </w:pPr>
+      <w:r>
+        <w:rPr>
           <w:b/>
+          <w:bCs/>
         </w:rPr>
-        <w:t xml:space="preserve">Digital Marketing:</w:t>
+        <w:t xml:space="preserve">Languages:</w:t>
       </w:r>
       <w:r>
         <w:t xml:space="preserve"> </w:t>
       </w:r>
       <w:r>
-        <w:t xml:space="preserve">Campaign strategy, social media management, SEO optimization, Google Ads, paid media, email marketing</w:t>
+        <w:t xml:space="preserve">Python, TypeScript, JavaScript, Rust, SQL, Bash</w:t>
       </w:r>
     </w:p>
     <w:p>
@@ -210,70 +198,34 @@
       </w:pPr>
       <w:r>
         <w:rPr>
+          <w:b/>
           <w:bCs/>
+        </w:rPr>
+        <w:t xml:space="preserve">Testing &amp; Quality:</w:t>
+      </w:r>
+      <w:r>
+        <w:t xml:space="preserve"> </w:t>
+      </w:r>
+      <w:r>
+        <w:t xml:space="preserve">pytest, Vitest, Jest, TDD, ruff, CodeQL — CI-gated across the fleet</w:t>
+      </w:r>
+    </w:p>
+    <w:p>
+      <w:pPr>
+        <w:pStyle w:val="BodyText"/>
+      </w:pPr>
+      <w:r>
+        <w:rPr>
           <w:b/>
+          <w:bCs/>
         </w:rPr>
-        <w:t xml:space="preserve">Design &amp; UX:</w:t>
+        <w:t xml:space="preserve">Frontend &amp; Tooling:</w:t>
       </w:r>
       <w:r>
         <w:t xml:space="preserve"> </w:t>
       </w:r>
       <w:r>
-        <w:t xml:space="preserve">UI/UX design, WordPress, custom HTML/CSS, responsive design, accessibility, wireframing</w:t>
-      </w:r>
-    </w:p>
-    <w:p>
-      <w:pPr>
-        <w:pStyle w:val="BodyText"/>
-      </w:pPr>
-      <w:r>
-        <w:rPr>
-          <w:bCs/>
-          <w:b/>
-        </w:rPr>
-        <w:t xml:space="preserve">Analytics:</w:t>
-      </w:r>
-      <w:r>
-        <w:t xml:space="preserve"> </w:t>
-      </w:r>
-      <w:r>
-        <w:t xml:space="preserve">Performance analytics, A/B testing, conversion optimization, Google Analytics, reporting dashboards</w:t>
-      </w:r>
-    </w:p>
-    <w:p>
-      <w:pPr>
-        <w:pStyle w:val="BodyText"/>
-      </w:pPr>
-      <w:r>
-        <w:rPr>
-          <w:bCs/>
-          <w:b/>
-        </w:rPr>
-        <w:t xml:space="preserve">Technical:</w:t>
-      </w:r>
-      <w:r>
-        <w:t xml:space="preserve"> </w:t>
-      </w:r>
-      <w:r>
-        <w:t xml:space="preserve">Python, TypeScript, JavaScript, Node.js, React, Astro, GitHub Actions, CI/CD, Docker</w:t>
-      </w:r>
-    </w:p>
-    <w:p>
-      <w:pPr>
-        <w:pStyle w:val="BodyText"/>
-      </w:pPr>
-      <w:r>
-        <w:rPr>
-          <w:bCs/>
-          <w:b/>
-        </w:rPr>
-        <w:t xml:space="preserve">Project Management:</w:t>
-      </w:r>
-      <w:r>
-        <w:t xml:space="preserve"> </w:t>
-      </w:r>
-      <w:r>
-        <w:t xml:space="preserve">Cross-functional team leadership, stakeholder management, Agile/Scrum, resource allocation</w:t>
+        <w:t xml:space="preserve">React, Next.js, Astro, Vite, pnpm monorepos, Zod, YAML/JSON Schema, Git</w:t>
       </w:r>
     </w:p>
     <w:bookmarkEnd w:id="25"/>
@@ -286,17 +238,17 @@
         <w:t xml:space="preserve">selected projects</w:t>
       </w:r>
     </w:p>
-    <w:bookmarkStart w:id="26" w:name="X2461ffb1925457cd434a00e58474c4715e89ad3"/>
+    <w:bookmarkStart w:id="26" w:name="state-public-record-data-platform"/>
     <w:p>
       <w:pPr>
         <w:pStyle w:val="Heading2"/>
       </w:pPr>
       <w:r>
         <w:rPr>
+          <w:b/>
           <w:bCs/>
-          <w:b/>
         </w:rPr>
-        <w:t xml:space="preserve">Forward Funders — Scalable Marketing Overhaul</w:t>
+        <w:t xml:space="preserve">50-State Public-Record Data Platform</w:t>
       </w:r>
     </w:p>
     <w:p>
@@ -304,7 +256,7 @@
         <w:pStyle w:val="FirstParagraph"/>
       </w:pPr>
       <w:r>
-        <w:t xml:space="preserve">Jan 2020</w:t>
+        <w:t xml:space="preserve">2024 — Present</w:t>
       </w:r>
     </w:p>
     <w:p>
@@ -315,7 +267,7 @@
         </w:numPr>
       </w:pPr>
       <w:r>
-        <w:t xml:space="preserve">Transitioned client from in-person cold-calling to fully digital marketing approach</w:t>
+        <w:t xml:space="preserve">Backend platform ingesting public records across all 50 U.S. states — 60+ collection agents, PostgreSQL, deployed on Terraform-provisioned AWS (multi-AZ RDS, Redis/ElastiCache, S3)</w:t>
       </w:r>
     </w:p>
     <w:p>
@@ -326,21 +278,21 @@
         </w:numPr>
       </w:pPr>
       <w:r>
-        <w:t xml:space="preserve">Designed and executed social media and Google Ads campaigns achieving 328% ROI; drove consistent lead generation and scalable growth</w:t>
+        <w:t xml:space="preserve">3,399 passing tests with circuit breakers, rate limiting, and graceful degradation for reliable large-scale collection</w:t>
       </w:r>
     </w:p>
     <w:bookmarkEnd w:id="26"/>
-    <w:bookmarkStart w:id="27" w:name="X0b407bf92b755affe6738bd7b358bafe5a2b9b1"/>
+    <w:bookmarkStart w:id="27" w:name="peer-audited-behavioral-blockchain"/>
     <w:p>
       <w:pPr>
         <w:pStyle w:val="Heading2"/>
       </w:pPr>
       <w:r>
         <w:rPr>
+          <w:b/>
           <w:bCs/>
-          <w:b/>
         </w:rPr>
-        <w:t xml:space="preserve">Boca Ballet Theatre — Nonprofit Digital Transformation</w:t>
+        <w:t xml:space="preserve">Peer-Audited Behavioral Blockchain</w:t>
       </w:r>
     </w:p>
     <w:p>
@@ -348,7 +300,7 @@
         <w:pStyle w:val="FirstParagraph"/>
       </w:pPr>
       <w:r>
-        <w:t xml:space="preserve">Jan 2020</w:t>
+        <w:t xml:space="preserve">2024 — Present</w:t>
       </w:r>
     </w:p>
     <w:p>
@@ -359,7 +311,7 @@
         </w:numPr>
       </w:pPr>
       <w:r>
-        <w:t xml:space="preserve">Rebuilt website and social media channels during COVID-19; managed ad campaigns driving funding and enabling remote performances</w:t>
+        <w:t xml:space="preserve">NestJS + Next.js + React Native + Tauri monorepo with Stripe escrow and a double-entry ledger; SHA-256 hash-chained audit log</w:t>
       </w:r>
     </w:p>
     <w:p>
@@ -370,21 +322,21 @@
         </w:numPr>
       </w:pPr>
       <w:r>
-        <w:t xml:space="preserve">Significantly boosted community engagement and donor contributions during critical period</w:t>
+        <w:t xml:space="preserve">1,107 tests behind CodeQL and CI gates; live pitch surface serving 200 OK</w:t>
       </w:r>
     </w:p>
     <w:bookmarkEnd w:id="27"/>
-    <w:bookmarkStart w:id="28" w:name="X6e29aa465a95fd573700188e7bb6e76bd0a1f8e"/>
+    <w:bookmarkStart w:id="28" w:name="agentic-titan-multi-agent-orchestrator"/>
     <w:p>
       <w:pPr>
         <w:pStyle w:val="Heading2"/>
       </w:pPr>
       <w:r>
         <w:rPr>
+          <w:b/>
           <w:bCs/>
-          <w:b/>
         </w:rPr>
-        <w:t xml:space="preserve">MET4MORFOSES — Multilingual Digital Storytelling</w:t>
+        <w:t xml:space="preserve">Agentic Titan — Multi-Agent Orchestrator</w:t>
       </w:r>
     </w:p>
     <w:p>
@@ -392,7 +344,7 @@
         <w:pStyle w:val="FirstParagraph"/>
       </w:pPr>
       <w:r>
-        <w:t xml:space="preserve">Jan 2022</w:t>
+        <w:t xml:space="preserve">2024 — Present</w:t>
       </w:r>
     </w:p>
     <w:p>
@@ -403,7 +355,7 @@
         </w:numPr>
       </w:pPr>
       <w:r>
-        <w:t xml:space="preserve">Produced interactive multilingual digital content exploring Western and Eastern cultural narratives</w:t>
+        <w:t xml:space="preserve">Model-agnostic orchestration framework coordinating Claude, Codex, and Gemini across 9 self-organizing topologies with a FastAPI control dashboard</w:t>
       </w:r>
     </w:p>
     <w:p>
@@ -414,21 +366,21 @@
         </w:numPr>
       </w:pPr>
       <w:r>
-        <w:t xml:space="preserve">Integrated UI/UX design and cross-platform strategies to engage diverse audiences</w:t>
+        <w:t xml:space="preserve">1,095+ tests; Redis task queuing, Celery workers, Ray Serve deployment</w:t>
       </w:r>
     </w:p>
     <w:bookmarkEnd w:id="28"/>
-    <w:bookmarkStart w:id="29" w:name="amp-lab-media-innovative-media-studies"/>
+    <w:bookmarkStart w:id="29" w:name="limen-self-healing-agent-fleet"/>
     <w:p>
       <w:pPr>
         <w:pStyle w:val="Heading2"/>
       </w:pPr>
       <w:r>
         <w:rPr>
+          <w:b/>
           <w:bCs/>
-          <w:b/>
         </w:rPr>
-        <w:t xml:space="preserve">Amp Lab Media — Innovative Media Studies</w:t>
+        <w:t xml:space="preserve">Limen — Self-Healing Agent Fleet</w:t>
       </w:r>
     </w:p>
     <w:p>
@@ -436,7 +388,7 @@
         <w:pStyle w:val="FirstParagraph"/>
       </w:pPr>
       <w:r>
-        <w:t xml:space="preserve">2019 — Present</w:t>
+        <w:t xml:space="preserve">2024 — Present</w:t>
       </w:r>
     </w:p>
     <w:p>
@@ -447,7 +399,7 @@
         </w:numPr>
       </w:pPr>
       <w:r>
-        <w:t xml:space="preserve">Directed and produced video content for nonprofit YouTube channel featuring Object Lesson series</w:t>
+        <w:t xml:space="preserve">Heartbeat-driven autonomic infrastructure that governs 309 repositories with a 9-rung organ ladder — task intake, dispatch, verification, and merge with near-zero manual upkeep</w:t>
       </w:r>
     </w:p>
     <w:p>
@@ -458,21 +410,21 @@
         </w:numPr>
       </w:pPr>
       <w:r>
-        <w:t xml:space="preserve">Managed full content lifecycle; optimized for audience engagement, increasing reach by 42%</w:t>
+        <w:t xml:space="preserve">Budget-capped, persona-gated task system with a FastAPI/Cloudflare-Worker runtime and GitHub-native storage</w:t>
       </w:r>
     </w:p>
     <w:bookmarkEnd w:id="29"/>
-    <w:bookmarkStart w:id="30" w:name="the-eight-organ-system"/>
+    <w:bookmarkStart w:id="30" w:name="ai-chat-exporter"/>
     <w:p>
       <w:pPr>
         <w:pStyle w:val="Heading2"/>
       </w:pPr>
       <w:r>
         <w:rPr>
+          <w:b/>
           <w:bCs/>
-          <w:b/>
         </w:rPr>
-        <w:t xml:space="preserve">The Eight-Organ System</w:t>
+        <w:t xml:space="preserve">AI Chat Exporter</w:t>
       </w:r>
     </w:p>
     <w:p>
@@ -489,15 +441,25 @@
           <w:ilvl w:val="0"/>
           <w:numId w:val="1006"/>
         </w:numPr>
-        <w:pStyle w:val="Compact"/>
-      </w:pPr>
-      <w:r>
-        <w:t xml:space="preserve">Designed and documented orchestration architecture across 91 repos, 8 orgs, ~386K words — demonstrating content lifecycle management at scale</w:t>
+      </w:pPr>
+      <w:r>
+        <w:t xml:space="preserve">~5,900-line TypeScript tool, 5 export formats, 9-language UI; 170 tests, 549 commits</w:t>
+      </w:r>
+    </w:p>
+    <w:p>
+      <w:pPr>
+        <w:numPr>
+          <w:ilvl w:val="0"/>
+          <w:numId w:val="1006"/>
+        </w:numPr>
+      </w:pPr>
+      <w:r>
+        <w:t xml:space="preserve">Distributed across GreasyFork, GitHub, Docker, and Cloudflare Pages</w:t>
       </w:r>
     </w:p>
     <w:bookmarkEnd w:id="30"/>
     <w:bookmarkEnd w:id="31"/>
-    <w:bookmarkStart w:id="37" w:name="experience"/>
+    <w:bookmarkStart w:id="36" w:name="experience"/>
     <w:p>
       <w:pPr>
         <w:pStyle w:val="Heading1"/>
@@ -506,20 +468,20 @@
         <w:t xml:space="preserve">Experience</w:t>
       </w:r>
     </w:p>
-    <w:bookmarkStart w:id="32" w:name="X18ad37f1806b110a2ad3f4c84d72000a3530cda"/>
+    <w:bookmarkStart w:id="32" w:name="X4ba9f411d250ac65b8f70fe3c9411221fde25c7"/>
     <w:p>
       <w:pPr>
         <w:pStyle w:val="Heading2"/>
       </w:pPr>
       <w:r>
         <w:rPr>
+          <w:b/>
           <w:bCs/>
-          <w:b/>
         </w:rPr>
-        <w:t xml:space="preserve">Miami Dade College Foundation</w:t>
-      </w:r>
-      <w:r>
-        <w:t xml:space="preserve">, Digital Marketing Manager</w:t>
+        <w:t xml:space="preserve">ORGANVM (Independent)</w:t>
+      </w:r>
+      <w:r>
+        <w:t xml:space="preserve">, Software Engineer &amp; Developer-Tools Builder</w:t>
       </w:r>
     </w:p>
     <w:p>
@@ -527,7 +489,7 @@
         <w:pStyle w:val="FirstParagraph"/>
       </w:pPr>
       <w:r>
-        <w:t xml:space="preserve">Miami, FL</w:t>
+        <w:t xml:space="preserve">New York City</w:t>
       </w:r>
     </w:p>
     <w:p>
@@ -535,7 +497,7 @@
         <w:pStyle w:val="BodyText"/>
       </w:pPr>
       <w:r>
-        <w:t xml:space="preserve">2023 – 2024</w:t>
+        <w:t xml:space="preserve">2020 – present</w:t>
       </w:r>
     </w:p>
     <w:p>
@@ -543,7 +505,7 @@
         <w:pStyle w:val="BodyText"/>
       </w:pPr>
       <w:r>
-        <w:t xml:space="preserve">1 year</w:t>
+        <w:t xml:space="preserve">6 years</w:t>
       </w:r>
     </w:p>
     <w:p>
@@ -554,7 +516,7 @@
         </w:numPr>
       </w:pPr>
       <w:r>
-        <w:t xml:space="preserve">Designed and executed targeted digital marketing campaigns, increasing donor engagement by 32% and surpassing fundraising goals</w:t>
+        <w:t xml:space="preserve">Designed and operate a 309-repository production system across 8 GitHub organizations, governed by a self-healing CI/CD fleet with automated dependency validation and promotion state machines</w:t>
       </w:r>
     </w:p>
     <w:p>
@@ -565,7 +527,7 @@
         </w:numPr>
       </w:pPr>
       <w:r>
-        <w:t xml:space="preserve">Produced multimedia storytelling content including videos and social media posts, driving 28% increase in click-through rates</w:t>
+        <w:t xml:space="preserve">Built backend platforms and developer tooling in Python and TypeScript — data pipelines, multi-agent AI orchestration, MCP gateways, and reliable automation — deployed on Docker, Terraform/AWS, and Cloudflare</w:t>
       </w:r>
     </w:p>
     <w:p>
@@ -576,46 +538,24 @@
         </w:numPr>
       </w:pPr>
       <w:r>
-        <w:t xml:space="preserve">Rebuilt and optimized foundation website — 38% traffic growth, 22% improvement in donation conversions</w:t>
-      </w:r>
-    </w:p>
-    <w:p>
-      <w:pPr>
-        <w:numPr>
-          <w:ilvl w:val="0"/>
-          <w:numId w:val="1007"/>
-        </w:numPr>
-      </w:pPr>
-      <w:r>
-        <w:t xml:space="preserve">Developed social media strategy boosting engagement rates across platforms by 23%</w:t>
-      </w:r>
-    </w:p>
-    <w:p>
-      <w:pPr>
-        <w:numPr>
-          <w:ilvl w:val="0"/>
-          <w:numId w:val="1007"/>
-        </w:numPr>
-      </w:pPr>
-      <w:r>
-        <w:t xml:space="preserve">Trained team members on advanced analytics tools, leading to 20% efficiency boost in reporting</w:t>
+        <w:t xml:space="preserve">Testing-first throughout: thousands of automated tests behind GitHub Actions CI gates across the estate</w:t>
       </w:r>
     </w:p>
     <w:bookmarkEnd w:id="32"/>
-    <w:bookmarkStart w:id="33" w:name="ajp-media-arts-multimedia-specialist"/>
+    <w:bookmarkStart w:id="33" w:name="X18ad37f1806b110a2ad3f4c84d72000a3530cda"/>
     <w:p>
       <w:pPr>
         <w:pStyle w:val="Heading2"/>
       </w:pPr>
       <w:r>
         <w:rPr>
+          <w:b/>
           <w:bCs/>
-          <w:b/>
         </w:rPr>
-        <w:t xml:space="preserve">AJP Media Arts</w:t>
-      </w:r>
-      <w:r>
-        <w:t xml:space="preserve">, Multimedia Specialist</w:t>
+        <w:t xml:space="preserve">Miami Dade College Foundation</w:t>
+      </w:r>
+      <w:r>
+        <w:t xml:space="preserve">, Digital Marketing Manager</w:t>
       </w:r>
     </w:p>
     <w:p>
@@ -623,7 +563,7 @@
         <w:pStyle w:val="FirstParagraph"/>
       </w:pPr>
       <w:r>
-        <w:t xml:space="preserve">New York City</w:t>
+        <w:t xml:space="preserve">Miami, FL</w:t>
       </w:r>
     </w:p>
     <w:p>
@@ -631,7 +571,7 @@
         <w:pStyle w:val="BodyText"/>
       </w:pPr>
       <w:r>
-        <w:t xml:space="preserve">2011 – present</w:t>
+        <w:t xml:space="preserve">2023 – 2024</w:t>
       </w:r>
     </w:p>
     <w:p>
@@ -639,79 +579,36 @@
         <w:pStyle w:val="BodyText"/>
       </w:pPr>
       <w:r>
-        <w:t xml:space="preserve">15 years</w:t>
-      </w:r>
-    </w:p>
-    <w:p>
-      <w:pPr>
+        <w:t xml:space="preserve">1 year</w:t>
+      </w:r>
+    </w:p>
+    <w:p>
+      <w:pPr>
+        <w:pStyle w:val="Compact"/>
         <w:numPr>
           <w:ilvl w:val="0"/>
           <w:numId w:val="1008"/>
         </w:numPr>
       </w:pPr>
       <w:r>
-        <w:t xml:space="preserve">Produced engaging video, audio, and visual campaigns achieving 17.5M+ views and contributing to $2M in client fundraising and revenue across 15 clients (2011–2024)</w:t>
-      </w:r>
-    </w:p>
-    <w:p>
-      <w:pPr>
-        <w:numPr>
-          <w:ilvl w:val="0"/>
-          <w:numId w:val="1008"/>
-        </w:numPr>
-      </w:pPr>
-      <w:r>
-        <w:t xml:space="preserve">Developed innovative marketing strategies integrating SEO and paid media — 290% ROI for key campaigns</w:t>
-      </w:r>
-    </w:p>
-    <w:p>
-      <w:pPr>
-        <w:numPr>
-          <w:ilvl w:val="0"/>
-          <w:numId w:val="1008"/>
-        </w:numPr>
-      </w:pPr>
-      <w:r>
-        <w:t xml:space="preserve">Launched and managed client websites using WordPress and custom HTML/CSS — 42% engagement increase, 30% speed improvement</w:t>
-      </w:r>
-    </w:p>
-    <w:p>
-      <w:pPr>
-        <w:numPr>
-          <w:ilvl w:val="0"/>
-          <w:numId w:val="1008"/>
-        </w:numPr>
-      </w:pPr>
-      <w:r>
-        <w:t xml:space="preserve">Conducted A/B testing and performance analysis to optimize campaigns — 27% engagement boost across client portfolios</w:t>
-      </w:r>
-    </w:p>
-    <w:p>
-      <w:pPr>
-        <w:numPr>
-          <w:ilvl w:val="0"/>
-          <w:numId w:val="1008"/>
-        </w:numPr>
-      </w:pPr>
-      <w:r>
-        <w:t xml:space="preserve">Delivered intuitive UI/UX designs for client platforms — 26% satisfaction increase, 35% retention improvement</w:t>
+        <w:t xml:space="preserve">Rebuilt the foundation website and ran data-driven campaigns that increased donor engagement 32% and improved donation conversions</w:t>
       </w:r>
     </w:p>
     <w:bookmarkEnd w:id="33"/>
-    <w:bookmarkStart w:id="34" w:name="X3fb6f109cb8fdccfb4062abc9b6321ccd924934"/>
+    <w:bookmarkStart w:id="34" w:name="X1def6a7547521b0cbc98d957fe815e95b0ec448"/>
     <w:p>
       <w:pPr>
         <w:pStyle w:val="Heading2"/>
       </w:pPr>
       <w:r>
         <w:rPr>
+          <w:b/>
           <w:bCs/>
-          <w:b/>
         </w:rPr>
-        <w:t xml:space="preserve">Miami Dade College, FAU, Nova Southeastern, Keiser, Young Harris College, Tarrant County Community College, Broward College, Palm Beach State College</w:t>
-      </w:r>
-      <w:r>
-        <w:t xml:space="preserve">, Instructor</w:t>
+        <w:t xml:space="preserve">Broward College, FAU, Miami Dade College, Nova Southeastern, Keiser, and others</w:t>
+      </w:r>
+      <w:r>
+        <w:t xml:space="preserve">, Instructor — Composition &amp; Writing</w:t>
       </w:r>
     </w:p>
     <w:p>
@@ -719,7 +616,7 @@
         <w:pStyle w:val="FirstParagraph"/>
       </w:pPr>
       <w:r>
-        <w:t xml:space="preserve">South Florida</w:t>
+        <w:t xml:space="preserve">Remote / South Florida</w:t>
       </w:r>
     </w:p>
     <w:p>
@@ -740,74 +637,31 @@
     </w:p>
     <w:p>
       <w:pPr>
+        <w:pStyle w:val="Compact"/>
         <w:numPr>
           <w:ilvl w:val="0"/>
           <w:numId w:val="1009"/>
         </w:numPr>
       </w:pPr>
       <w:r>
-        <w:t xml:space="preserve">Designed and delivered 100+ composition courses to 2,000+ students — 85% above-average grade achievement</w:t>
-      </w:r>
-    </w:p>
-    <w:p>
-      <w:pPr>
-        <w:numPr>
-          <w:ilvl w:val="0"/>
-          <w:numId w:val="1009"/>
-        </w:numPr>
-      </w:pPr>
-      <w:r>
-        <w:t xml:space="preserve">Applied UX principles to create accessible course materials — 92% student approval rating</w:t>
-      </w:r>
-    </w:p>
-    <w:p>
-      <w:pPr>
-        <w:numPr>
-          <w:ilvl w:val="0"/>
-          <w:numId w:val="1009"/>
-        </w:numPr>
-      </w:pPr>
-      <w:r>
-        <w:t xml:space="preserve">Enhanced lectures with multimedia tools, driving 22% increase in engagement</w:t>
-      </w:r>
-    </w:p>
-    <w:p>
-      <w:pPr>
-        <w:numPr>
-          <w:ilvl w:val="0"/>
-          <w:numId w:val="1009"/>
-        </w:numPr>
-      </w:pPr>
-      <w:r>
-        <w:t xml:space="preserve">Managed course lifecycle from concept to completion — 97% completion rate</w:t>
-      </w:r>
-    </w:p>
-    <w:p>
-      <w:pPr>
-        <w:numPr>
-          <w:ilvl w:val="0"/>
-          <w:numId w:val="1009"/>
-        </w:numPr>
-      </w:pPr>
-      <w:r>
-        <w:t xml:space="preserve">Refined teaching methods using performance analytics — 24% improvement in student retention</w:t>
+        <w:t xml:space="preserve">Designed and taught 100+ college composition courses to 2,000+ students across 8+ institutions; built accessible, analytics-informed curricula</w:t>
       </w:r>
     </w:p>
     <w:bookmarkEnd w:id="34"/>
-    <w:bookmarkStart w:id="35" w:name="independent-creative-technologist"/>
+    <w:bookmarkStart w:id="35" w:name="ajp-media-arts-multimedia-specialist"/>
     <w:p>
       <w:pPr>
         <w:pStyle w:val="Heading2"/>
       </w:pPr>
       <w:r>
         <w:rPr>
+          <w:b/>
           <w:bCs/>
-          <w:b/>
         </w:rPr>
-        <w:t xml:space="preserve">Independent</w:t>
-      </w:r>
-      <w:r>
-        <w:t xml:space="preserve">, Creative Technologist</w:t>
+        <w:t xml:space="preserve">AJP Media Arts</w:t>
+      </w:r>
+      <w:r>
+        <w:t xml:space="preserve">, Multimedia Specialist</w:t>
       </w:r>
     </w:p>
     <w:p>
@@ -823,7 +677,7 @@
         <w:pStyle w:val="BodyText"/>
       </w:pPr>
       <w:r>
-        <w:t xml:space="preserve">2021 – present</w:t>
+        <w:t xml:space="preserve">2011 – 2020</w:t>
       </w:r>
     </w:p>
     <w:p>
@@ -831,136 +685,41 @@
         <w:pStyle w:val="BodyText"/>
       </w:pPr>
       <w:r>
-        <w:t xml:space="preserve">5 years</w:t>
-      </w:r>
-    </w:p>
-    <w:p>
-      <w:pPr>
+        <w:t xml:space="preserve">9 years</w:t>
+      </w:r>
+    </w:p>
+    <w:p>
+      <w:pPr>
+        <w:pStyle w:val="Compact"/>
         <w:numPr>
           <w:ilvl w:val="0"/>
           <w:numId w:val="1010"/>
         </w:numPr>
       </w:pPr>
       <w:r>
-        <w:t xml:space="preserve">Designed and launched eight-organ orchestration system coordinating 91 repos across 8 GitHub organizations with ~386K words of documentation</w:t>
-      </w:r>
-    </w:p>
-    <w:p>
-      <w:pPr>
-        <w:numPr>
-          <w:ilvl w:val="0"/>
-          <w:numId w:val="1010"/>
-        </w:numPr>
-      </w:pPr>
-      <w:r>
-        <w:t xml:space="preserve">Built generative art and music systems, interactive installations, and AI-conductor workflow for human-AI co-creation</w:t>
+        <w:t xml:space="preserve">Produced video, audio, and web campaigns for arts and nonprofit clients — 17.5M+ views and $2M in attributed client fundraising</w:t>
       </w:r>
     </w:p>
     <w:bookmarkEnd w:id="35"/>
-    <w:bookmarkStart w:id="36" w:name="majestic-design-project-manager"/>
+    <w:bookmarkEnd w:id="36"/>
+    <w:bookmarkStart w:id="39" w:name="education"/>
+    <w:p>
+      <w:pPr>
+        <w:pStyle w:val="Heading1"/>
+      </w:pPr>
+      <w:r>
+        <w:t xml:space="preserve">Education</w:t>
+      </w:r>
+    </w:p>
+    <w:bookmarkStart w:id="37" w:name="X2ee197ba801a53bf8ecdd526b7d2b2388b35088"/>
     <w:p>
       <w:pPr>
         <w:pStyle w:val="Heading2"/>
       </w:pPr>
       <w:r>
         <w:rPr>
+          <w:b/>
           <w:bCs/>
-          <w:b/>
-        </w:rPr>
-        <w:t xml:space="preserve">Majestic Design</w:t>
-      </w:r>
-      <w:r>
-        <w:t xml:space="preserve">, Project Manager</w:t>
-      </w:r>
-    </w:p>
-    <w:p>
-      <w:pPr>
-        <w:pStyle w:val="FirstParagraph"/>
-      </w:pPr>
-      <w:r>
-        <w:t xml:space="preserve">New York City</w:t>
-      </w:r>
-    </w:p>
-    <w:p>
-      <w:pPr>
-        <w:pStyle w:val="BodyText"/>
-      </w:pPr>
-      <w:r>
-        <w:t xml:space="preserve">2007 – 2018</w:t>
-      </w:r>
-    </w:p>
-    <w:p>
-      <w:pPr>
-        <w:pStyle w:val="BodyText"/>
-      </w:pPr>
-      <w:r>
-        <w:t xml:space="preserve">11 years</w:t>
-      </w:r>
-    </w:p>
-    <w:p>
-      <w:pPr>
-        <w:numPr>
-          <w:ilvl w:val="0"/>
-          <w:numId w:val="1011"/>
-        </w:numPr>
-      </w:pPr>
-      <w:r>
-        <w:t xml:space="preserve">Led 50 commercial and residential construction projects from concept to completion — 90% on-time, within budget</w:t>
-      </w:r>
-    </w:p>
-    <w:p>
-      <w:pPr>
-        <w:numPr>
-          <w:ilvl w:val="0"/>
-          <w:numId w:val="1011"/>
-        </w:numPr>
-      </w:pPr>
-      <w:r>
-        <w:t xml:space="preserve">Produced project visualizations and promotional materials including 3D renderings and video walkthroughs — 25% increase in repeat business</w:t>
-      </w:r>
-    </w:p>
-    <w:p>
-      <w:pPr>
-        <w:numPr>
-          <w:ilvl w:val="0"/>
-          <w:numId w:val="1011"/>
-        </w:numPr>
-      </w:pPr>
-      <w:r>
-        <w:t xml:space="preserve">Built and maintained strong stakeholder relationships — 88% satisfaction rate</w:t>
-      </w:r>
-    </w:p>
-    <w:p>
-      <w:pPr>
-        <w:numPr>
-          <w:ilvl w:val="0"/>
-          <w:numId w:val="1011"/>
-        </w:numPr>
-      </w:pPr>
-      <w:r>
-        <w:t xml:space="preserve">Implemented risk mitigation strategies reducing project delays by 15%; 93% of projects met or exceeded standards</w:t>
-      </w:r>
-    </w:p>
-    <w:bookmarkEnd w:id="36"/>
-    <w:bookmarkEnd w:id="37"/>
-    <w:bookmarkStart w:id="40" w:name="education"/>
-    <w:p>
-      <w:pPr>
-        <w:pStyle w:val="Heading1"/>
-      </w:pPr>
-      <w:r>
-        <w:t xml:space="preserve">Education</w:t>
-      </w:r>
-    </w:p>
-    <w:bookmarkStart w:id="38" w:name="X2ee197ba801a53bf8ecdd526b7d2b2388b35088"/>
-    <w:p>
-      <w:pPr>
-        <w:pStyle w:val="Heading2"/>
-      </w:pPr>
-      <w:r>
-        <w:rPr>
-          <w:bCs/>
-          <w:b/>
         </w:rPr>
         <w:t xml:space="preserve">Florida Atlantic University</w:t>
       </w:r>
@@ -974,8 +733,8 @@
       </w:pPr>
       <w:r>
         <w:rPr>
+          <w:b/>
           <w:bCs/>
-          <w:b/>
         </w:rPr>
         <w:t xml:space="preserve">M.F.A.</w:t>
       </w:r>
@@ -988,16 +747,16 @@
         <w:t xml:space="preserve">2015 – 2018</w:t>
       </w:r>
     </w:p>
-    <w:bookmarkEnd w:id="38"/>
-    <w:bookmarkStart w:id="39" w:name="X32d25e31eb5063a17b71cab77cbef01f3228272"/>
+    <w:bookmarkEnd w:id="37"/>
+    <w:bookmarkStart w:id="38" w:name="X32d25e31eb5063a17b71cab77cbef01f3228272"/>
     <w:p>
       <w:pPr>
         <w:pStyle w:val="Heading2"/>
       </w:pPr>
       <w:r>
         <w:rPr>
+          <w:b/>
           <w:bCs/>
-          <w:b/>
         </w:rPr>
         <w:t xml:space="preserve">CUNY College of Staten Island</w:t>
       </w:r>
@@ -1011,8 +770,8 @@
       </w:pPr>
       <w:r>
         <w:rPr>
+          <w:b/>
           <w:bCs/>
-          <w:b/>
         </w:rPr>
         <w:t xml:space="preserve">B.A.</w:t>
       </w:r>
@@ -1025,9 +784,9 @@
         <w:t xml:space="preserve">2010 – 2014</w:t>
       </w:r>
     </w:p>
+    <w:bookmarkEnd w:id="38"/>
     <w:bookmarkEnd w:id="39"/>
-    <w:bookmarkEnd w:id="40"/>
-    <w:bookmarkStart w:id="41" w:name="certifications"/>
+    <w:bookmarkStart w:id="40" w:name="certifications"/>
     <w:p>
       <w:pPr>
         <w:pStyle w:val="Heading1"/>
@@ -1042,8 +801,8 @@
       </w:pPr>
       <w:r>
         <w:rPr>
+          <w:b/>
           <w:bCs/>
-          <w:b/>
         </w:rPr>
         <w:t xml:space="preserve">Full-Stack Developer — Meta:</w:t>
       </w:r>
@@ -1051,7 +810,7 @@
         <w:t xml:space="preserve"> </w:t>
       </w:r>
       <w:r>
-        <w:t xml:space="preserve">2023 — 2024</w:t>
+        <w:t xml:space="preserve">2024</w:t>
       </w:r>
     </w:p>
     <w:p>
@@ -1060,8 +819,8 @@
       </w:pPr>
       <w:r>
         <w:rPr>
+          <w:b/>
           <w:bCs/>
-          <w:b/>
         </w:rPr>
         <w:t xml:space="preserve">UX Design — Google:</w:t>
       </w:r>
@@ -1069,7 +828,7 @@
         <w:t xml:space="preserve"> </w:t>
       </w:r>
       <w:r>
-        <w:t xml:space="preserve">2022 — 2023</w:t>
+        <w:t xml:space="preserve">2023</w:t>
       </w:r>
     </w:p>
     <w:p>
@@ -1078,8 +837,8 @@
       </w:pPr>
       <w:r>
         <w:rPr>
+          <w:b/>
           <w:bCs/>
-          <w:b/>
         </w:rPr>
         <w:t xml:space="preserve">Digital Marketing &amp; E-commerce — Google:</w:t>
       </w:r>
@@ -1087,7 +846,7 @@
         <w:t xml:space="preserve"> </w:t>
       </w:r>
       <w:r>
-        <w:t xml:space="preserve">2022 — 2023</w:t>
+        <w:t xml:space="preserve">2023</w:t>
       </w:r>
     </w:p>
     <w:p>
@@ -1096,8 +855,8 @@
       </w:pPr>
       <w:r>
         <w:rPr>
+          <w:b/>
           <w:bCs/>
-          <w:b/>
         </w:rPr>
         <w:t xml:space="preserve">Project Management — Google:</w:t>
       </w:r>
@@ -1105,11 +864,15 @@
         <w:t xml:space="preserve"> </w:t>
       </w:r>
       <w:r>
-        <w:t xml:space="preserve">2022 — 2023</w:t>
-      </w:r>
-    </w:p>
-    <w:bookmarkEnd w:id="41"/>
-    <w:sectPr/>
+        <w:t xml:space="preserve">2023</w:t>
+      </w:r>
+    </w:p>
+    <w:bookmarkEnd w:id="40"/>
+    <w:sectPr>
+      <w:footnotePr>
+        <w:numRestart w:val="eachSect"/>
+      </w:footnotePr>
+    </w:sectPr>
   </w:body>
 </w:document>
 </file>
@@ -1140,14 +903,14 @@
 <file path=word/numbering.xml><?xml version="1.0" encoding="utf-8"?>
 <w:numbering xmlns:w="http://schemas.openxmlformats.org/wordprocessingml/2006/main">
   <w:abstractNum w:abstractNumId="990">
-    <w:nsid w:val="A990"/>
+    <w:nsid w:val="0000A990"/>
     <w:multiLevelType w:val="multilevel"/>
     <w:lvl w:ilvl="0">
       <w:numFmt w:val="bullet"/>
       <w:lvlText w:val=" "/>
       <w:lvlJc w:val="left"/>
       <w:pPr>
-        <w:ind w:left="720" w:hanging="480"/>
+        <w:ind w:left="720" w:hanging="360"/>
       </w:pPr>
     </w:lvl>
     <w:lvl w:ilvl="1">
@@ -1155,7 +918,7 @@
       <w:lvlText w:val=" "/>
       <w:lvlJc w:val="left"/>
       <w:pPr>
-        <w:ind w:left="1440" w:hanging="480"/>
+        <w:ind w:left="1440" w:hanging="360"/>
       </w:pPr>
     </w:lvl>
     <w:lvl w:ilvl="2">
@@ -1163,7 +926,7 @@
       <w:lvlText w:val=" "/>
       <w:lvlJc w:val="left"/>
       <w:pPr>
-        <w:ind w:left="2160" w:hanging="480"/>
+        <w:ind w:left="2160" w:hanging="360"/>
       </w:pPr>
     </w:lvl>
     <w:lvl w:ilvl="3">
@@ -1171,7 +934,7 @@
       <w:lvlText w:val=" "/>
       <w:lvlJc w:val="left"/>
       <w:pPr>
-        <w:ind w:left="2880" w:hanging="480"/>
+        <w:ind w:left="2880" w:hanging="360"/>
       </w:pPr>
     </w:lvl>
     <w:lvl w:ilvl="4">
@@ -1179,7 +942,7 @@
       <w:lvlText w:val=" "/>
       <w:lvlJc w:val="left"/>
       <w:pPr>
-        <w:ind w:left="3600" w:hanging="480"/>
+        <w:ind w:left="3600" w:hanging="360"/>
       </w:pPr>
     </w:lvl>
     <w:lvl w:ilvl="5">
@@ -1187,7 +950,7 @@
       <w:lvlText w:val=" "/>
       <w:lvlJc w:val="left"/>
       <w:pPr>
-        <w:ind w:left="4320" w:hanging="480"/>
+        <w:ind w:left="4320" w:hanging="360"/>
       </w:pPr>
     </w:lvl>
     <w:lvl w:ilvl="6">
@@ -1195,7 +958,7 @@
       <w:lvlText w:val=" "/>
       <w:lvlJc w:val="left"/>
       <w:pPr>
-        <w:ind w:left="5040" w:hanging="480"/>
+        <w:ind w:left="5040" w:hanging="360"/>
       </w:pPr>
     </w:lvl>
     <w:lvl w:ilvl="7">
@@ -1203,7 +966,7 @@
       <w:lvlText w:val=" "/>
       <w:lvlJc w:val="left"/>
       <w:pPr>
-        <w:ind w:left="5760" w:hanging="480"/>
+        <w:ind w:left="5760" w:hanging="360"/>
       </w:pPr>
     </w:lvl>
     <w:lvl w:ilvl="8">
@@ -1211,84 +974,111 @@
       <w:lvlText w:val=" "/>
       <w:lvlJc w:val="left"/>
       <w:pPr>
-        <w:ind w:left="6480" w:hanging="480"/>
+        <w:ind w:left="6480" w:hanging="360"/>
       </w:pPr>
     </w:lvl>
   </w:abstractNum>
   <w:abstractNum w:abstractNumId="991">
-    <w:nsid w:val="A991"/>
+    <w:nsid w:val="0000A991"/>
     <w:multiLevelType w:val="multilevel"/>
     <w:lvl w:ilvl="0">
       <w:numFmt w:val="bullet"/>
-      <w:lvlText w:val="•"/>
+      <w:lvlText w:val=""/>
       <w:lvlJc w:val="left"/>
       <w:pPr>
-        <w:ind w:left="720" w:hanging="480"/>
-      </w:pPr>
+        <w:ind w:left="720" w:hanging="360"/>
+      </w:pPr>
+      <w:rPr>
+        <w:rFonts w:ascii="Symbol" w:hAnsi="Symbol" w:cs="Symbol" w:hint="default"/>
+      </w:rPr>
     </w:lvl>
     <w:lvl w:ilvl="1">
       <w:numFmt w:val="bullet"/>
-      <w:lvlText w:val="–"/>
+      <w:lvlText w:val="o"/>
       <w:lvlJc w:val="left"/>
       <w:pPr>
-        <w:ind w:left="1440" w:hanging="480"/>
-      </w:pPr>
+        <w:ind w:left="1440" w:hanging="360"/>
+      </w:pPr>
+      <w:rPr>
+        <w:rFonts w:ascii="Courier New" w:hAnsi="Courier New" w:cs="Courier New" w:hint="default"/>
+      </w:rPr>
     </w:lvl>
     <w:lvl w:ilvl="2">
       <w:numFmt w:val="bullet"/>
-      <w:lvlText w:val="•"/>
+      <w:lvlText w:val=""/>
       <w:lvlJc w:val="left"/>
       <w:pPr>
-        <w:ind w:left="2160" w:hanging="480"/>
-      </w:pPr>
+        <w:ind w:left="2160" w:hanging="360"/>
+      </w:pPr>
+      <w:rPr>
+        <w:rFonts w:ascii="Wingdings" w:hAnsi="Wingdings" w:cs="Wingdings" w:hint="default"/>
+      </w:rPr>
     </w:lvl>
     <w:lvl w:ilvl="3">
       <w:numFmt w:val="bullet"/>
-      <w:lvlText w:val="–"/>
+      <w:lvlText w:val=""/>
       <w:lvlJc w:val="left"/>
       <w:pPr>
-        <w:ind w:left="2880" w:hanging="480"/>
-      </w:pPr>
+        <w:ind w:left="2880" w:hanging="360"/>
+      </w:pPr>
+      <w:rPr>
+        <w:rFonts w:ascii="Symbol" w:hAnsi="Symbol" w:cs="Symbol" w:hint="default"/>
+      </w:rPr>
     </w:lvl>
     <w:lvl w:ilvl="4">
       <w:numFmt w:val="bullet"/>
-      <w:lvlText w:val="•"/>
+      <w:lvlText w:val="o"/>
       <w:lvlJc w:val="left"/>
       <w:pPr>
-        <w:ind w:left="3600" w:hanging="480"/>
-      </w:pPr>
+        <w:ind w:left="3600" w:hanging="360"/>
+      </w:pPr>
+      <w:rPr>
+        <w:rFonts w:ascii="Courier New" w:hAnsi="Courier New" w:cs="Courier New" w:hint="default"/>
+      </w:rPr>
     </w:lvl>
     <w:lvl w:ilvl="5">
       <w:numFmt w:val="bullet"/>
-      <w:lvlText w:val="–"/>
+      <w:lvlText w:val=""/>
       <w:lvlJc w:val="left"/>
       <w:pPr>
-        <w:ind w:left="4320" w:hanging="480"/>
-      </w:pPr>
+        <w:ind w:left="4320" w:hanging="360"/>
+      </w:pPr>
+      <w:rPr>
+        <w:rFonts w:ascii="Wingdings" w:hAnsi="Wingdings" w:cs="Wingdings" w:hint="default"/>
+      </w:rPr>
     </w:lvl>
     <w:lvl w:ilvl="6">
       <w:numFmt w:val="bullet"/>
-      <w:lvlText w:val="•"/>
+      <w:lvlText w:val=""/>
       <w:lvlJc w:val="left"/>
       <w:pPr>
-        <w:ind w:left="5040" w:hanging="480"/>
-      </w:pPr>
+        <w:ind w:left="5040" w:hanging="360"/>
+      </w:pPr>
+      <w:rPr>
+        <w:rFonts w:ascii="Symbol" w:hAnsi="Symbol" w:cs="Symbol" w:hint="default"/>
+      </w:rPr>
     </w:lvl>
     <w:lvl w:ilvl="7">
       <w:numFmt w:val="bullet"/>
-      <w:lvlText w:val="–"/>
+      <w:lvlText w:val="o"/>
       <w:lvlJc w:val="left"/>
       <w:pPr>
-        <w:ind w:left="5760" w:hanging="480"/>
-      </w:pPr>
+        <w:ind w:left="5760" w:hanging="360"/>
+      </w:pPr>
+      <w:rPr>
+        <w:rFonts w:ascii="Courier New" w:hAnsi="Courier New" w:cs="Courier New" w:hint="default"/>
+      </w:rPr>
     </w:lvl>
     <w:lvl w:ilvl="8">
       <w:numFmt w:val="bullet"/>
-      <w:lvlText w:val="•"/>
+      <w:lvlText w:val=""/>
       <w:lvlJc w:val="left"/>
       <w:pPr>
-        <w:ind w:left="6480" w:hanging="480"/>
-      </w:pPr>
+        <w:ind w:left="6480" w:hanging="360"/>
+      </w:pPr>
+      <w:rPr>
+        <w:rFonts w:ascii="Wingdings" w:hAnsi="Wingdings" w:cs="Wingdings" w:hint="default"/>
+      </w:rPr>
     </w:lvl>
   </w:abstractNum>
   <w:num w:numId="1000">
@@ -1324,9 +1114,6 @@
   <w:num w:numId="1010">
     <w:abstractNumId w:val="991"/>
   </w:num>
-  <w:num w:numId="1011">
-    <w:abstractNumId w:val="991"/>
-  </w:num>
 </w:numbering>
 </file>
 
@@ -1356,10 +1143,10 @@
     <w:name w:val="Body Text"/>
     <w:basedOn w:val="Normal"/>
     <w:link w:val="BodyTextChar"/>
+    <w:qFormat/>
     <w:pPr>
       <w:spacing w:after="180" w:before="180"/>
     </w:pPr>
-    <w:qFormat/>
   </w:style>
   <w:style w:customStyle="1" w:styleId="FirstParagraph" w:type="paragraph">
     <w:name w:val="First Paragraph"/>
@@ -1379,36 +1166,69 @@
     <w:name w:val="Title"/>
     <w:basedOn w:val="Normal"/>
     <w:next w:val="BodyText"/>
-    <w:qFormat/>
-    <w:pPr>
-      <w:keepNext/>
-      <w:keepLines/>
-      <w:spacing w:after="240" w:before="480"/>
+    <w:link w:val="TitleChar"/>
+    <w:uiPriority w:val="10"/>
+    <w:qFormat/>
+    <w:rsid w:val="00A10FD9"/>
+    <w:pPr>
+      <w:spacing w:after="80" w:line="240" w:lineRule="auto"/>
+      <w:contextualSpacing/>
       <w:jc w:val="center"/>
     </w:pPr>
     <w:rPr>
       <w:rFonts w:asciiTheme="majorHAnsi" w:cstheme="majorBidi" w:eastAsiaTheme="majorEastAsia" w:hAnsiTheme="majorHAnsi"/>
-      <w:b/>
-      <w:bCs/>
-      <w:color w:themeColor="accent1" w:themeShade="B5" w:val="345A8A"/>
-      <w:sz w:val="36"/>
-      <w:szCs w:val="36"/>
+      <w:spacing w:val="-10"/>
+      <w:kern w:val="28"/>
+      <w:sz w:val="56"/>
+      <w:szCs w:val="56"/>
+    </w:rPr>
+  </w:style>
+  <w:style w:customStyle="1" w:styleId="TitleChar" w:type="character">
+    <w:name w:val="Title Char"/>
+    <w:basedOn w:val="DefaultParagraphFont"/>
+    <w:link w:val="Title"/>
+    <w:uiPriority w:val="10"/>
+    <w:rsid w:val="00A10FD9"/>
+    <w:rPr>
+      <w:rFonts w:asciiTheme="majorHAnsi" w:cstheme="majorBidi" w:eastAsiaTheme="majorEastAsia" w:hAnsiTheme="majorHAnsi"/>
+      <w:spacing w:val="-10"/>
+      <w:kern w:val="28"/>
+      <w:sz w:val="56"/>
+      <w:szCs w:val="56"/>
     </w:rPr>
   </w:style>
   <w:style w:styleId="Subtitle" w:type="paragraph">
     <w:name w:val="Subtitle"/>
     <w:basedOn w:val="Title"/>
     <w:next w:val="BodyText"/>
-    <w:qFormat/>
-    <w:pPr>
-      <w:keepNext/>
-      <w:keepLines/>
-      <w:spacing w:after="240" w:before="240"/>
-      <w:jc w:val="center"/>
-    </w:pPr>
-    <w:rPr>
-      <w:sz w:val="30"/>
-      <w:szCs w:val="30"/>
+    <w:link w:val="SubtitleChar"/>
+    <w:uiPriority w:val="11"/>
+    <w:qFormat/>
+    <w:rsid w:val="00A10FD9"/>
+    <w:pPr>
+      <w:numPr>
+        <w:ilvl w:val="1"/>
+      </w:numPr>
+    </w:pPr>
+    <w:rPr>
+      <w:rFonts w:cstheme="majorBidi" w:eastAsiaTheme="majorEastAsia"/>
+      <w:spacing w:val="15"/>
+      <w:sz w:val="28"/>
+      <w:szCs w:val="28"/>
+    </w:rPr>
+  </w:style>
+  <w:style w:customStyle="1" w:styleId="SubtitleChar" w:type="character">
+    <w:name w:val="Subtitle Char"/>
+    <w:basedOn w:val="DefaultParagraphFont"/>
+    <w:link w:val="Subtitle"/>
+    <w:uiPriority w:val="11"/>
+    <w:rsid w:val="00A10FD9"/>
+    <w:rPr>
+      <w:rFonts w:cstheme="majorBidi" w:eastAsiaTheme="majorEastAsia"/>
+      <w:color w:themeColor="text1" w:themeTint="A6" w:val="595959"/>
+      <w:spacing w:val="15"/>
+      <w:sz w:val="28"/>
+      <w:szCs w:val="28"/>
     </w:rPr>
   </w:style>
   <w:style w:customStyle="1" w:styleId="Author" w:type="paragraph">
@@ -1439,15 +1259,13 @@
     <w:pPr>
       <w:keepNext/>
       <w:keepLines/>
+      <w:spacing w:after="0" w:before="300"/>
       <w:jc w:val="center"/>
-      <w:spacing w:after="0" w:before="300"/>
-    </w:pPr>
-    <w:rPr>
+    </w:pPr>
+    <w:rPr>
+      <w:b/>
       <w:sz w:val="20"/>
       <w:szCs w:val="20"/>
-      <w:b/>
-      <w:color w:val="345A8A"/>
-      &gt;
     </w:rPr>
   </w:style>
   <w:style w:customStyle="1" w:styleId="Abstract" w:type="paragraph">
@@ -1474,191 +1292,321 @@
     <w:rPr/>
   </w:style>
   <w:style w:styleId="Heading1" w:type="paragraph">
-    <w:name w:val="Heading 1"/>
+    <w:name w:val="heading 1"/>
     <w:basedOn w:val="Normal"/>
     <w:next w:val="BodyText"/>
+    <w:link w:val="Heading1Char"/>
     <w:uiPriority w:val="9"/>
     <w:qFormat/>
+    <w:rsid w:val="00A10FD9"/>
     <w:pPr>
       <w:keepNext/>
       <w:keepLines/>
-      <w:spacing w:after="0" w:before="480"/>
+      <w:spacing w:after="80" w:before="360"/>
       <w:outlineLvl w:val="0"/>
     </w:pPr>
     <w:rPr>
       <w:rFonts w:asciiTheme="majorHAnsi" w:cstheme="majorBidi" w:eastAsiaTheme="majorEastAsia" w:hAnsiTheme="majorHAnsi"/>
-      <w:b/>
-      <w:bCs/>
-      <w:color w:themeColor="accent1" w:val="4F81BD"/>
+      <w:color w:themeColor="accent1" w:themeShade="BF" w:val="0F4761"/>
+      <w:sz w:val="40"/>
+      <w:szCs w:val="40"/>
+    </w:rPr>
+  </w:style>
+  <w:style w:styleId="Heading2" w:type="paragraph">
+    <w:name w:val="heading 2"/>
+    <w:basedOn w:val="Normal"/>
+    <w:next w:val="BodyText"/>
+    <w:link w:val="Heading2Char"/>
+    <w:uiPriority w:val="9"/>
+    <w:semiHidden/>
+    <w:unhideWhenUsed/>
+    <w:qFormat/>
+    <w:rsid w:val="00A10FD9"/>
+    <w:pPr>
+      <w:keepNext/>
+      <w:keepLines/>
+      <w:spacing w:after="80" w:before="160"/>
+      <w:outlineLvl w:val="1"/>
+    </w:pPr>
+    <w:rPr>
+      <w:rFonts w:asciiTheme="majorHAnsi" w:cstheme="majorBidi" w:eastAsiaTheme="majorEastAsia" w:hAnsiTheme="majorHAnsi"/>
+      <w:color w:themeColor="accent1" w:themeShade="BF" w:val="0F4761"/>
       <w:sz w:val="32"/>
       <w:szCs w:val="32"/>
     </w:rPr>
   </w:style>
-  <w:style w:styleId="Heading2" w:type="paragraph">
-    <w:name w:val="Heading 2"/>
+  <w:style w:styleId="Heading3" w:type="paragraph">
+    <w:name w:val="heading 3"/>
     <w:basedOn w:val="Normal"/>
     <w:next w:val="BodyText"/>
+    <w:link w:val="Heading3Char"/>
     <w:uiPriority w:val="9"/>
+    <w:semiHidden/>
     <w:unhideWhenUsed/>
     <w:qFormat/>
+    <w:rsid w:val="00A10FD9"/>
     <w:pPr>
       <w:keepNext/>
       <w:keepLines/>
-      <w:spacing w:after="0" w:before="200"/>
-      <w:outlineLvl w:val="1"/>
-    </w:pPr>
-    <w:rPr>
-      <w:rFonts w:asciiTheme="majorHAnsi" w:cstheme="majorBidi" w:eastAsiaTheme="majorEastAsia" w:hAnsiTheme="majorHAnsi"/>
-      <w:b/>
-      <w:bCs/>
-      <w:color w:themeColor="accent1" w:val="4F81BD"/>
+      <w:spacing w:after="80" w:before="160"/>
+      <w:outlineLvl w:val="2"/>
+    </w:pPr>
+    <w:rPr>
+      <w:rFonts w:cstheme="majorBidi" w:eastAsiaTheme="majorEastAsia"/>
+      <w:color w:themeColor="accent1" w:themeShade="BF" w:val="0F4761"/>
       <w:sz w:val="28"/>
       <w:szCs w:val="28"/>
     </w:rPr>
   </w:style>
-  <w:style w:styleId="Heading3" w:type="paragraph">
-    <w:name w:val="Heading 3"/>
+  <w:style w:styleId="Heading4" w:type="paragraph">
+    <w:name w:val="heading 4"/>
     <w:basedOn w:val="Normal"/>
     <w:next w:val="BodyText"/>
+    <w:link w:val="Heading4Char"/>
     <w:uiPriority w:val="9"/>
+    <w:semiHidden/>
     <w:unhideWhenUsed/>
     <w:qFormat/>
+    <w:rsid w:val="00A10FD9"/>
     <w:pPr>
       <w:keepNext/>
       <w:keepLines/>
-      <w:spacing w:after="0" w:before="200"/>
-      <w:outlineLvl w:val="2"/>
-    </w:pPr>
-    <w:rPr>
-      <w:rFonts w:asciiTheme="majorHAnsi" w:cstheme="majorBidi" w:eastAsiaTheme="majorEastAsia" w:hAnsiTheme="majorHAnsi"/>
-      <w:b/>
-      <w:bCs/>
-      <w:color w:themeColor="accent1" w:val="4F81BD"/>
-      <w:sz w:val="24"/>
-      <w:szCs w:val="24"/>
-    </w:rPr>
-  </w:style>
-  <w:style w:styleId="Heading4" w:type="paragraph">
-    <w:name w:val="Heading 4"/>
+      <w:spacing w:after="40" w:before="80"/>
+      <w:outlineLvl w:val="3"/>
+    </w:pPr>
+    <w:rPr>
+      <w:rFonts w:cstheme="majorBidi" w:eastAsiaTheme="majorEastAsia"/>
+      <w:i/>
+      <w:iCs/>
+      <w:color w:themeColor="accent1" w:themeShade="BF" w:val="0F4761"/>
+    </w:rPr>
+  </w:style>
+  <w:style w:styleId="Heading5" w:type="paragraph">
+    <w:name w:val="heading 5"/>
     <w:basedOn w:val="Normal"/>
     <w:next w:val="BodyText"/>
+    <w:link w:val="Heading5Char"/>
     <w:uiPriority w:val="9"/>
+    <w:semiHidden/>
     <w:unhideWhenUsed/>
     <w:qFormat/>
+    <w:rsid w:val="00A10FD9"/>
     <w:pPr>
       <w:keepNext/>
       <w:keepLines/>
-      <w:spacing w:after="0" w:before="200"/>
-      <w:outlineLvl w:val="3"/>
-    </w:pPr>
-    <w:rPr>
-      <w:rFonts w:asciiTheme="majorHAnsi" w:cstheme="majorBidi" w:eastAsiaTheme="majorEastAsia" w:hAnsiTheme="majorHAnsi"/>
-      <w:i/>
-      <w:bCs/>
-      <w:color w:themeColor="accent1" w:val="4F81BD"/>
-      <w:sz w:val="24"/>
-      <w:szCs w:val="24"/>
-    </w:rPr>
-  </w:style>
-  <w:style w:styleId="Heading5" w:type="paragraph">
-    <w:name w:val="Heading 5"/>
+      <w:spacing w:after="40" w:before="80"/>
+      <w:outlineLvl w:val="4"/>
+    </w:pPr>
+    <w:rPr>
+      <w:rFonts w:cstheme="majorBidi" w:eastAsiaTheme="majorEastAsia"/>
+      <w:color w:themeColor="accent1" w:themeShade="BF" w:val="0F4761"/>
+    </w:rPr>
+  </w:style>
+  <w:style w:styleId="Heading6" w:type="paragraph">
+    <w:name w:val="heading 6"/>
     <w:basedOn w:val="Normal"/>
     <w:next w:val="BodyText"/>
+    <w:link w:val="Heading6Char"/>
     <w:uiPriority w:val="9"/>
+    <w:semiHidden/>
     <w:unhideWhenUsed/>
     <w:qFormat/>
+    <w:rsid w:val="00A10FD9"/>
     <w:pPr>
       <w:keepNext/>
       <w:keepLines/>
-      <w:spacing w:after="0" w:before="200"/>
-      <w:outlineLvl w:val="4"/>
-    </w:pPr>
-    <w:rPr>
-      <w:rFonts w:asciiTheme="majorHAnsi" w:cstheme="majorBidi" w:eastAsiaTheme="majorEastAsia" w:hAnsiTheme="majorHAnsi"/>
+      <w:spacing w:after="0" w:before="40"/>
+      <w:outlineLvl w:val="5"/>
+    </w:pPr>
+    <w:rPr>
+      <w:rFonts w:cstheme="majorBidi" w:eastAsiaTheme="majorEastAsia"/>
+      <w:i/>
       <w:iCs/>
-      <w:color w:themeColor="accent1" w:val="4F81BD"/>
-      <w:sz w:val="24"/>
-      <w:szCs w:val="24"/>
-    </w:rPr>
-  </w:style>
-  <w:style w:styleId="Heading6" w:type="paragraph">
-    <w:name w:val="Heading 6"/>
+      <w:color w:themeColor="text1" w:themeTint="A6" w:val="595959"/>
+    </w:rPr>
+  </w:style>
+  <w:style w:styleId="Heading7" w:type="paragraph">
+    <w:name w:val="heading 7"/>
     <w:basedOn w:val="Normal"/>
     <w:next w:val="BodyText"/>
+    <w:link w:val="Heading7Char"/>
     <w:uiPriority w:val="9"/>
+    <w:semiHidden/>
     <w:unhideWhenUsed/>
     <w:qFormat/>
+    <w:rsid w:val="00A10FD9"/>
     <w:pPr>
       <w:keepNext/>
       <w:keepLines/>
-      <w:spacing w:after="0" w:before="200"/>
-      <w:outlineLvl w:val="5"/>
-    </w:pPr>
-    <w:rPr>
-      <w:rFonts w:asciiTheme="majorHAnsi" w:cstheme="majorBidi" w:eastAsiaTheme="majorEastAsia" w:hAnsiTheme="majorHAnsi"/>
-      <w:color w:themeColor="accent1" w:val="4F81BD"/>
-      <w:sz w:val="24"/>
-      <w:szCs w:val="24"/>
-    </w:rPr>
-  </w:style>
-  <w:style w:styleId="Heading7" w:type="paragraph">
-    <w:name w:val="Heading 7"/>
+      <w:spacing w:after="0" w:before="40"/>
+      <w:outlineLvl w:val="6"/>
+    </w:pPr>
+    <w:rPr>
+      <w:rFonts w:cstheme="majorBidi" w:eastAsiaTheme="majorEastAsia"/>
+      <w:color w:themeColor="text1" w:themeTint="A6" w:val="595959"/>
+    </w:rPr>
+  </w:style>
+  <w:style w:styleId="Heading8" w:type="paragraph">
+    <w:name w:val="heading 8"/>
     <w:basedOn w:val="Normal"/>
     <w:next w:val="BodyText"/>
+    <w:link w:val="Heading8Char"/>
     <w:uiPriority w:val="9"/>
+    <w:semiHidden/>
     <w:unhideWhenUsed/>
     <w:qFormat/>
+    <w:rsid w:val="00A10FD9"/>
     <w:pPr>
       <w:keepNext/>
       <w:keepLines/>
-      <w:spacing w:after="0" w:before="200"/>
-      <w:outlineLvl w:val="6"/>
-    </w:pPr>
-    <w:rPr>
-      <w:rFonts w:asciiTheme="majorHAnsi" w:cstheme="majorBidi" w:eastAsiaTheme="majorEastAsia" w:hAnsiTheme="majorHAnsi"/>
-      <w:color w:themeColor="accent1" w:val="4F81BD"/>
-      <w:sz w:val="24"/>
-      <w:szCs w:val="24"/>
-    </w:rPr>
-  </w:style>
-  <w:style w:styleId="Heading8" w:type="paragraph">
-    <w:name w:val="Heading 8"/>
+      <w:spacing w:after="0"/>
+      <w:outlineLvl w:val="7"/>
+    </w:pPr>
+    <w:rPr>
+      <w:rFonts w:cstheme="majorBidi" w:eastAsiaTheme="majorEastAsia"/>
+      <w:i/>
+      <w:iCs/>
+      <w:color w:themeColor="text1" w:themeTint="D8" w:val="272727"/>
+    </w:rPr>
+  </w:style>
+  <w:style w:styleId="Heading9" w:type="paragraph">
+    <w:name w:val="heading 9"/>
     <w:basedOn w:val="Normal"/>
     <w:next w:val="BodyText"/>
+    <w:link w:val="Heading9Char"/>
     <w:uiPriority w:val="9"/>
+    <w:semiHidden/>
     <w:unhideWhenUsed/>
     <w:qFormat/>
+    <w:rsid w:val="00A10FD9"/>
     <w:pPr>
       <w:keepNext/>
       <w:keepLines/>
-      <w:spacing w:after="0" w:before="200"/>
-      <w:outlineLvl w:val="7"/>
-    </w:pPr>
+      <w:spacing w:after="0"/>
+      <w:outlineLvl w:val="8"/>
+    </w:pPr>
+    <w:rPr>
+      <w:rFonts w:cstheme="majorBidi" w:eastAsiaTheme="majorEastAsia"/>
+      <w:color w:themeColor="text1" w:themeTint="D8" w:val="272727"/>
+    </w:rPr>
+  </w:style>
+  <w:style w:customStyle="1" w:styleId="Heading1Char" w:type="character">
+    <w:name w:val="Heading 1 Char"/>
+    <w:basedOn w:val="DefaultParagraphFont"/>
+    <w:link w:val="Heading1"/>
+    <w:uiPriority w:val="9"/>
+    <w:rsid w:val="00A10FD9"/>
     <w:rPr>
       <w:rFonts w:asciiTheme="majorHAnsi" w:cstheme="majorBidi" w:eastAsiaTheme="majorEastAsia" w:hAnsiTheme="majorHAnsi"/>
-      <w:color w:themeColor="accent1" w:val="4F81BD"/>
-      <w:sz w:val="24"/>
-      <w:szCs w:val="24"/>
-    </w:rPr>
-  </w:style>
-  <w:style w:styleId="Heading9" w:type="paragraph">
-    <w:name w:val="Heading 9"/>
-    <w:basedOn w:val="Normal"/>
-    <w:next w:val="BodyText"/>
+      <w:color w:themeColor="accent1" w:themeShade="BF" w:val="0F4761"/>
+      <w:sz w:val="40"/>
+      <w:szCs w:val="40"/>
+    </w:rPr>
+  </w:style>
+  <w:style w:customStyle="1" w:styleId="Heading2Char" w:type="character">
+    <w:name w:val="Heading 2 Char"/>
+    <w:basedOn w:val="DefaultParagraphFont"/>
+    <w:link w:val="Heading2"/>
     <w:uiPriority w:val="9"/>
-    <w:unhideWhenUsed/>
-    <w:qFormat/>
-    <w:pPr>
-      <w:keepNext/>
-      <w:keepLines/>
-      <w:spacing w:after="0" w:before="200"/>
-      <w:outlineLvl w:val="8"/>
-    </w:pPr>
+    <w:semiHidden/>
+    <w:rsid w:val="00A10FD9"/>
     <w:rPr>
       <w:rFonts w:asciiTheme="majorHAnsi" w:cstheme="majorBidi" w:eastAsiaTheme="majorEastAsia" w:hAnsiTheme="majorHAnsi"/>
-      <w:color w:themeColor="accent1" w:val="4F81BD"/>
-      <w:sz w:val="24"/>
-      <w:szCs w:val="24"/>
+      <w:color w:themeColor="accent1" w:themeShade="BF" w:val="0F4761"/>
+      <w:sz w:val="32"/>
+      <w:szCs w:val="32"/>
+    </w:rPr>
+  </w:style>
+  <w:style w:customStyle="1" w:styleId="Heading3Char" w:type="character">
+    <w:name w:val="Heading 3 Char"/>
+    <w:basedOn w:val="DefaultParagraphFont"/>
+    <w:link w:val="Heading3"/>
+    <w:uiPriority w:val="9"/>
+    <w:semiHidden/>
+    <w:rsid w:val="00A10FD9"/>
+    <w:rPr>
+      <w:rFonts w:cstheme="majorBidi" w:eastAsiaTheme="majorEastAsia"/>
+      <w:color w:themeColor="accent1" w:themeShade="BF" w:val="0F4761"/>
+      <w:sz w:val="28"/>
+      <w:szCs w:val="28"/>
+    </w:rPr>
+  </w:style>
+  <w:style w:customStyle="1" w:styleId="Heading4Char" w:type="character">
+    <w:name w:val="Heading 4 Char"/>
+    <w:basedOn w:val="DefaultParagraphFont"/>
+    <w:link w:val="Heading4"/>
+    <w:uiPriority w:val="9"/>
+    <w:semiHidden/>
+    <w:rsid w:val="00A10FD9"/>
+    <w:rPr>
+      <w:rFonts w:cstheme="majorBidi" w:eastAsiaTheme="majorEastAsia"/>
+      <w:i/>
+      <w:iCs/>
+      <w:color w:themeColor="accent1" w:themeShade="BF" w:val="0F4761"/>
+    </w:rPr>
+  </w:style>
+  <w:style w:customStyle="1" w:styleId="Heading5Char" w:type="character">
+    <w:name w:val="Heading 5 Char"/>
+    <w:basedOn w:val="DefaultParagraphFont"/>
+    <w:link w:val="Heading5"/>
+    <w:uiPriority w:val="9"/>
+    <w:semiHidden/>
+    <w:rsid w:val="00A10FD9"/>
+    <w:rPr>
+      <w:rFonts w:cstheme="majorBidi" w:eastAsiaTheme="majorEastAsia"/>
+      <w:color w:themeColor="accent1" w:themeShade="BF" w:val="0F4761"/>
+    </w:rPr>
+  </w:style>
+  <w:style w:customStyle="1" w:styleId="Heading6Char" w:type="character">
+    <w:name w:val="Heading 6 Char"/>
+    <w:basedOn w:val="DefaultParagraphFont"/>
+    <w:link w:val="Heading6"/>
+    <w:uiPriority w:val="9"/>
+    <w:semiHidden/>
+    <w:rsid w:val="00A10FD9"/>
+    <w:rPr>
+      <w:rFonts w:cstheme="majorBidi" w:eastAsiaTheme="majorEastAsia"/>
+      <w:i/>
+      <w:iCs/>
+      <w:color w:themeColor="text1" w:themeTint="A6" w:val="595959"/>
+    </w:rPr>
+  </w:style>
+  <w:style w:customStyle="1" w:styleId="Heading7Char" w:type="character">
+    <w:name w:val="Heading 7 Char"/>
+    <w:basedOn w:val="DefaultParagraphFont"/>
+    <w:link w:val="Heading7"/>
+    <w:uiPriority w:val="9"/>
+    <w:semiHidden/>
+    <w:rsid w:val="00A10FD9"/>
+    <w:rPr>
+      <w:rFonts w:cstheme="majorBidi" w:eastAsiaTheme="majorEastAsia"/>
+      <w:color w:themeColor="text1" w:themeTint="A6" w:val="595959"/>
+    </w:rPr>
+  </w:style>
+  <w:style w:customStyle="1" w:styleId="Heading8Char" w:type="character">
+    <w:name w:val="Heading 8 Char"/>
+    <w:basedOn w:val="DefaultParagraphFont"/>
+    <w:link w:val="Heading8"/>
+    <w:uiPriority w:val="9"/>
+    <w:semiHidden/>
+    <w:rsid w:val="00A10FD9"/>
+    <w:rPr>
+      <w:rFonts w:cstheme="majorBidi" w:eastAsiaTheme="majorEastAsia"/>
+      <w:i/>
+      <w:iCs/>
+      <w:color w:themeColor="text1" w:themeTint="D8" w:val="272727"/>
+    </w:rPr>
+  </w:style>
+  <w:style w:customStyle="1" w:styleId="Heading9Char" w:type="character">
+    <w:name w:val="Heading 9 Char"/>
+    <w:basedOn w:val="DefaultParagraphFont"/>
+    <w:link w:val="Heading9"/>
+    <w:uiPriority w:val="9"/>
+    <w:semiHidden/>
+    <w:rsid w:val="00A10FD9"/>
+    <w:rPr>
+      <w:rFonts w:cstheme="majorBidi" w:eastAsiaTheme="majorEastAsia"/>
+      <w:color w:themeColor="text1" w:themeTint="D8" w:val="272727"/>
     </w:rPr>
   </w:style>
   <w:style w:styleId="BlockText" w:type="paragraph">
@@ -1680,6 +1628,18 @@
     <w:uiPriority w:val="9"/>
     <w:unhideWhenUsed/>
     <w:qFormat/>
+  </w:style>
+  <w:style w:styleId="FootnoteBlockText" w:type="paragraph">
+    <w:name w:val="Footnote Block Text"/>
+    <w:basedOn w:val="FootnoteText"/>
+    <w:next w:val="FootnoteText"/>
+    <w:uiPriority w:val="9"/>
+    <w:unhideWhenUsed/>
+    <w:qFormat/>
+    <w:pPr>
+      <w:spacing w:after="100" w:before="100"/>
+      <w:ind w:firstLine="0" w:left="480" w:right="480"/>
+    </w:pPr>
   </w:style>
   <w:style w:default="1" w:styleId="DefaultParagraphFont" w:type="character">
     <w:name w:val="Default Paragraph Font"/>
@@ -1710,10 +1670,10 @@
         <w:jc w:val="left"/>
       </w:trPr>
       <w:tcPr>
-        <w:vAlign w:val="bottom"/>
         <w:tcBorders>
           <w:bottom w:val="single"/>
         </w:tcBorders>
+        <w:vAlign w:val="bottom"/>
       </w:tcPr>
     </w:tblStylePr>
   </w:style>
@@ -1828,8 +1788,8 @@
     <w:name w:val="KeywordTok"/>
     <w:basedOn w:val="VerbatimChar"/>
     <w:rPr>
+      <w:b/>
       <w:color w:val="007020"/>
-      <w:b/>
     </w:rPr>
   </w:style>
   <w:style w:type="character" w:customStyle="1" w:styleId="DataTypeTok">
@@ -1906,42 +1866,42 @@
     <w:name w:val="ImportTok"/>
     <w:basedOn w:val="VerbatimChar"/>
     <w:rPr>
+      <w:b/>
       <w:color w:val="008000"/>
-      <w:b/>
     </w:rPr>
   </w:style>
   <w:style w:type="character" w:customStyle="1" w:styleId="CommentTok">
     <w:name w:val="CommentTok"/>
     <w:basedOn w:val="VerbatimChar"/>
     <w:rPr>
+      <w:i/>
       <w:color w:val="60a0b0"/>
-      <w:i/>
     </w:rPr>
   </w:style>
   <w:style w:type="character" w:customStyle="1" w:styleId="DocumentationTok">
     <w:name w:val="DocumentationTok"/>
     <w:basedOn w:val="VerbatimChar"/>
     <w:rPr>
+      <w:i/>
       <w:color w:val="ba2121"/>
-      <w:i/>
     </w:rPr>
   </w:style>
   <w:style w:type="character" w:customStyle="1" w:styleId="AnnotationTok">
     <w:name w:val="AnnotationTok"/>
     <w:basedOn w:val="VerbatimChar"/>
     <w:rPr>
-      <w:color w:val="60a0b0"/>
       <w:b/>
       <w:i/>
+      <w:color w:val="60a0b0"/>
     </w:rPr>
   </w:style>
   <w:style w:type="character" w:customStyle="1" w:styleId="CommentVarTok">
     <w:name w:val="CommentVarTok"/>
     <w:basedOn w:val="VerbatimChar"/>
     <w:rPr>
-      <w:color w:val="60a0b0"/>
       <w:b/>
       <w:i/>
+      <w:color w:val="60a0b0"/>
     </w:rPr>
   </w:style>
   <w:style w:type="character" w:customStyle="1" w:styleId="OtherTok">
@@ -1969,8 +1929,8 @@
     <w:name w:val="ControlFlowTok"/>
     <w:basedOn w:val="VerbatimChar"/>
     <w:rPr>
+      <w:b/>
       <w:color w:val="007020"/>
-      <w:b/>
     </w:rPr>
   </w:style>
   <w:style w:type="character" w:customStyle="1" w:styleId="OperatorTok">
@@ -2015,34 +1975,34 @@
     <w:name w:val="InformationTok"/>
     <w:basedOn w:val="VerbatimChar"/>
     <w:rPr>
-      <w:color w:val="60a0b0"/>
       <w:b/>
       <w:i/>
+      <w:color w:val="60a0b0"/>
     </w:rPr>
   </w:style>
   <w:style w:type="character" w:customStyle="1" w:styleId="WarningTok">
     <w:name w:val="WarningTok"/>
     <w:basedOn w:val="VerbatimChar"/>
     <w:rPr>
-      <w:color w:val="60a0b0"/>
       <w:b/>
       <w:i/>
+      <w:color w:val="60a0b0"/>
     </w:rPr>
   </w:style>
   <w:style w:type="character" w:customStyle="1" w:styleId="AlertTok">
     <w:name w:val="AlertTok"/>
     <w:basedOn w:val="VerbatimChar"/>
     <w:rPr>
+      <w:b/>
       <w:color w:val="ff0000"/>
-      <w:b/>
     </w:rPr>
   </w:style>
   <w:style w:type="character" w:customStyle="1" w:styleId="ErrorTok">
     <w:name w:val="ErrorTok"/>
     <w:basedOn w:val="VerbatimChar"/>
     <w:rPr>
+      <w:b/>
       <w:color w:val="ff0000"/>
-      <w:b/>
     </w:rPr>
   </w:style>
   <w:style w:type="character" w:customStyle="1" w:styleId="NormalTok">
@@ -2064,44 +2024,44 @@
         <a:sysClr val="window" lastClr="FFFFFF"/>
       </a:lt1>
       <a:dk2>
-        <a:srgbClr val="1F497D"/>
+        <a:srgbClr val="0E2841"/>
       </a:dk2>
       <a:lt2>
-        <a:srgbClr val="EEECE1"/>
+        <a:srgbClr val="E8E8E8"/>
       </a:lt2>
       <a:accent1>
-        <a:srgbClr val="4F81BD"/>
+        <a:srgbClr val="156082"/>
       </a:accent1>
       <a:accent2>
-        <a:srgbClr val="C0504D"/>
+        <a:srgbClr val="E97132"/>
       </a:accent2>
       <a:accent3>
-        <a:srgbClr val="9BBB59"/>
+        <a:srgbClr val="196B24"/>
       </a:accent3>
       <a:accent4>
-        <a:srgbClr val="8064A2"/>
+        <a:srgbClr val="0F9ED5"/>
       </a:accent4>
       <a:accent5>
-        <a:srgbClr val="4BACC6"/>
+        <a:srgbClr val="A02B93"/>
       </a:accent5>
       <a:accent6>
-        <a:srgbClr val="F79646"/>
+        <a:srgbClr val="4EA72E"/>
       </a:accent6>
       <a:hlink>
-        <a:srgbClr val="0000FF"/>
+        <a:srgbClr val="467886"/>
       </a:hlink>
       <a:folHlink>
-        <a:srgbClr val="800080"/>
+        <a:srgbClr val="96607D"/>
       </a:folHlink>
     </a:clrScheme>
     <a:fontScheme name="Office">
       <a:majorFont>
-        <a:latin typeface="Calibri"/>
+        <a:latin typeface="Aptos Display" panose="02110004020202020204"/>
         <a:ea typeface=""/>
         <a:cs typeface=""/>
-        <a:font script="Jpan" typeface="ＭＳ ゴシック"/>
+        <a:font script="Jpan" typeface="游ゴシック Light"/>
         <a:font script="Hang" typeface="맑은 고딕"/>
-        <a:font script="Hans" typeface="宋体"/>
+        <a:font script="Hans" typeface="等线 Light"/>
         <a:font script="Hant" typeface="新細明體"/>
         <a:font script="Arab" typeface="Times New Roman"/>
         <a:font script="Hebr" typeface="Times New Roman"/>
@@ -2128,14 +2088,32 @@
         <a:font script="Mong" typeface="Mongolian Baiti"/>
         <a:font script="Viet" typeface="Times New Roman"/>
         <a:font script="Uigh" typeface="Microsoft Uighur"/>
+        <a:font script="Geor" typeface="Sylfaen"/>
+        <a:font script="Armn" typeface="Arial"/>
+        <a:font script="Bugi" typeface="Leelawadee UI"/>
+        <a:font script="Bopo" typeface="Microsoft JhengHei"/>
+        <a:font script="Java" typeface="Javanese Text"/>
+        <a:font script="Lisu" typeface="Segoe UI"/>
+        <a:font script="Mymr" typeface="Myanmar Text"/>
+        <a:font script="Nkoo" typeface="Ebrima"/>
+        <a:font script="Olck" typeface="Nirmala UI"/>
+        <a:font script="Osma" typeface="Ebrima"/>
+        <a:font script="Phag" typeface="Phagspa"/>
+        <a:font script="Syrn" typeface="Estrangelo Edessa"/>
+        <a:font script="Syrj" typeface="Estrangelo Edessa"/>
+        <a:font script="Syre" typeface="Estrangelo Edessa"/>
+        <a:font script="Sora" typeface="Nirmala UI"/>
+        <a:font script="Tale" typeface="Microsoft Tai Le"/>
+        <a:font script="Talu" typeface="Microsoft New Tai Lue"/>
+        <a:font script="Tfng" typeface="Ebrima"/>
       </a:majorFont>
       <a:minorFont>
-        <a:latin typeface="Cambria"/>
+        <a:latin typeface="Aptos" panose="02110004020202020204"/>
         <a:ea typeface=""/>
         <a:cs typeface=""/>
-        <a:font script="Jpan" typeface="ＭＳ 明朝"/>
+        <a:font script="Jpan" typeface="游明朝"/>
         <a:font script="Hang" typeface="맑은 고딕"/>
-        <a:font script="Hans" typeface="宋体"/>
+        <a:font script="Hans" typeface="等线"/>
         <a:font script="Hant" typeface="新細明體"/>
         <a:font script="Arab" typeface="Arial"/>
         <a:font script="Hebr" typeface="Arial"/>
@@ -2162,6 +2140,24 @@
         <a:font script="Mong" typeface="Mongolian Baiti"/>
         <a:font script="Viet" typeface="Arial"/>
         <a:font script="Uigh" typeface="Microsoft Uighur"/>
+        <a:font script="Geor" typeface="Sylfaen"/>
+        <a:font script="Armn" typeface="Arial"/>
+        <a:font script="Bugi" typeface="Leelawadee UI"/>
+        <a:font script="Bopo" typeface="Microsoft JhengHei"/>
+        <a:font script="Java" typeface="Javanese Text"/>
+        <a:font script="Lisu" typeface="Segoe UI"/>
+        <a:font script="Mymr" typeface="Myanmar Text"/>
+        <a:font script="Nkoo" typeface="Ebrima"/>
+        <a:font script="Olck" typeface="Nirmala UI"/>
+        <a:font script="Osma" typeface="Ebrima"/>
+        <a:font script="Phag" typeface="Phagspa"/>
+        <a:font script="Syrn" typeface="Estrangelo Edessa"/>
+        <a:font script="Syrj" typeface="Estrangelo Edessa"/>
+        <a:font script="Syre" typeface="Estrangelo Edessa"/>
+        <a:font script="Sora" typeface="Nirmala UI"/>
+        <a:font script="Tale" typeface="Microsoft Tai Le"/>
+        <a:font script="Talu" typeface="Microsoft New Tai Lue"/>
+        <a:font script="Tfng" typeface="Ebrima"/>
       </a:minorFont>
     </a:fontScheme>
     <a:fmtScheme name="Office">
@@ -2173,200 +2169,141 @@
           <a:gsLst>
             <a:gs pos="0">
               <a:schemeClr val="phClr">
-                <a:tint val="50000"/>
-                <a:satMod val="300000"/>
+                <a:lumMod val="110000"/>
+                <a:satMod val="105000"/>
+                <a:tint val="67000"/>
               </a:schemeClr>
             </a:gs>
-            <a:gs pos="35000">
+            <a:gs pos="50000">
               <a:schemeClr val="phClr">
-                <a:tint val="37000"/>
-                <a:satMod val="300000"/>
+                <a:lumMod val="105000"/>
+                <a:satMod val="103000"/>
+                <a:tint val="73000"/>
               </a:schemeClr>
             </a:gs>
             <a:gs pos="100000">
               <a:schemeClr val="phClr">
-                <a:tint val="15000"/>
-                <a:satMod val="350000"/>
+                <a:lumMod val="105000"/>
+                <a:satMod val="109000"/>
+                <a:tint val="81000"/>
               </a:schemeClr>
             </a:gs>
           </a:gsLst>
-          <a:lin ang="16200000" scaled="1"/>
+          <a:lin ang="5400000" scaled="0"/>
         </a:gradFill>
         <a:gradFill rotWithShape="1">
           <a:gsLst>
             <a:gs pos="0">
               <a:schemeClr val="phClr">
-                <a:tint val="100000"/>
+                <a:satMod val="103000"/>
+                <a:lumMod val="102000"/>
+                <a:tint val="94000"/>
+              </a:schemeClr>
+            </a:gs>
+            <a:gs pos="50000">
+              <a:schemeClr val="phClr">
+                <a:satMod val="110000"/>
+                <a:lumMod val="100000"/>
                 <a:shade val="100000"/>
-                <a:satMod val="130000"/>
               </a:schemeClr>
             </a:gs>
             <a:gs pos="100000">
               <a:schemeClr val="phClr">
-                <a:tint val="50000"/>
-                <a:shade val="100000"/>
-                <a:satMod val="350000"/>
+                <a:lumMod val="99000"/>
+                <a:satMod val="120000"/>
+                <a:shade val="78000"/>
               </a:schemeClr>
             </a:gs>
           </a:gsLst>
-          <a:lin ang="16200000" scaled="0"/>
+          <a:lin ang="5400000" scaled="0"/>
         </a:gradFill>
       </a:fillStyleLst>
       <a:lnStyleLst>
-        <a:ln w="9525" cap="flat" cmpd="sng" algn="ctr">
-          <a:solidFill>
-            <a:schemeClr val="phClr">
-              <a:shade val="95000"/>
-              <a:satMod val="105000"/>
-            </a:schemeClr>
-          </a:solidFill>
-          <a:prstDash val="solid"/>
-        </a:ln>
-        <a:ln w="25400" cap="flat" cmpd="sng" algn="ctr">
+        <a:ln w="6350" cap="flat" cmpd="sng" algn="ctr">
           <a:solidFill>
             <a:schemeClr val="phClr"/>
           </a:solidFill>
           <a:prstDash val="solid"/>
+          <a:miter lim="800000"/>
         </a:ln>
-        <a:ln w="38100" cap="flat" cmpd="sng" algn="ctr">
+        <a:ln w="12700" cap="flat" cmpd="sng" algn="ctr">
           <a:solidFill>
             <a:schemeClr val="phClr"/>
           </a:solidFill>
           <a:prstDash val="solid"/>
+          <a:miter lim="800000"/>
+        </a:ln>
+        <a:ln w="19050" cap="flat" cmpd="sng" algn="ctr">
+          <a:solidFill>
+            <a:schemeClr val="phClr"/>
+          </a:solidFill>
+          <a:prstDash val="solid"/>
+          <a:miter lim="800000"/>
         </a:ln>
       </a:lnStyleLst>
       <a:effectStyleLst>
         <a:effectStyle>
+          <a:effectLst/>
+        </a:effectStyle>
+        <a:effectStyle>
+          <a:effectLst/>
+        </a:effectStyle>
+        <a:effectStyle>
           <a:effectLst>
-            <a:outerShdw blurRad="40000" dist="20000" dir="5400000" rotWithShape="0">
+            <a:outerShdw blurRad="57150" dist="19050" dir="5400000" algn="ctr" rotWithShape="0">
               <a:srgbClr val="000000">
-                <a:alpha val="38000"/>
+                <a:alpha val="63000"/>
               </a:srgbClr>
             </a:outerShdw>
           </a:effectLst>
-        </a:effectStyle>
-        <a:effectStyle>
-          <a:effectLst>
-            <a:outerShdw blurRad="40000" dist="23000" dir="5400000" rotWithShape="0">
-              <a:srgbClr val="000000">
-                <a:alpha val="35000"/>
-              </a:srgbClr>
-            </a:outerShdw>
-          </a:effectLst>
-        </a:effectStyle>
-        <a:effectStyle>
-          <a:effectLst>
-            <a:outerShdw blurRad="40000" dist="23000" dir="5400000" rotWithShape="0">
-              <a:srgbClr val="000000">
-                <a:alpha val="35000"/>
-              </a:srgbClr>
-            </a:outerShdw>
-          </a:effectLst>
-          <a:scene3d>
-            <a:camera prst="orthographicFront">
-              <a:rot lat="0" lon="0" rev="0"/>
-            </a:camera>
-            <a:lightRig rig="threePt" dir="t">
-              <a:rot lat="0" lon="0" rev="1200000"/>
-            </a:lightRig>
-          </a:scene3d>
-          <a:sp3d>
-            <a:bevelT w="63500" h="25400"/>
-          </a:sp3d>
         </a:effectStyle>
       </a:effectStyleLst>
       <a:bgFillStyleLst>
         <a:solidFill>
           <a:schemeClr val="phClr"/>
         </a:solidFill>
+        <a:solidFill>
+          <a:schemeClr val="phClr">
+            <a:tint val="95000"/>
+            <a:satMod val="170000"/>
+          </a:schemeClr>
+        </a:solidFill>
         <a:gradFill rotWithShape="1">
           <a:gsLst>
             <a:gs pos="0">
               <a:schemeClr val="phClr">
-                <a:tint val="40000"/>
-                <a:satMod val="350000"/>
+                <a:tint val="93000"/>
+                <a:satMod val="150000"/>
+                <a:shade val="98000"/>
+                <a:lumMod val="102000"/>
               </a:schemeClr>
             </a:gs>
-            <a:gs pos="40000">
+            <a:gs pos="50000">
               <a:schemeClr val="phClr">
-                <a:tint val="45000"/>
-                <a:shade val="99000"/>
-                <a:satMod val="350000"/>
+                <a:tint val="98000"/>
+                <a:satMod val="130000"/>
+                <a:shade val="90000"/>
+                <a:lumMod val="103000"/>
               </a:schemeClr>
             </a:gs>
             <a:gs pos="100000">
               <a:schemeClr val="phClr">
-                <a:shade val="20000"/>
-                <a:satMod val="255000"/>
+                <a:shade val="63000"/>
+                <a:satMod val="120000"/>
               </a:schemeClr>
             </a:gs>
           </a:gsLst>
-          <a:path path="circle">
-            <a:fillToRect l="50000" t="-80000" r="50000" b="180000"/>
-          </a:path>
-        </a:gradFill>
-        <a:gradFill rotWithShape="1">
-          <a:gsLst>
-            <a:gs pos="0">
-              <a:schemeClr val="phClr">
-                <a:tint val="80000"/>
-                <a:satMod val="300000"/>
-              </a:schemeClr>
-            </a:gs>
-            <a:gs pos="100000">
-              <a:schemeClr val="phClr">
-                <a:shade val="30000"/>
-                <a:satMod val="200000"/>
-              </a:schemeClr>
-            </a:gs>
-          </a:gsLst>
-          <a:path path="circle">
-            <a:fillToRect l="50000" t="50000" r="50000" b="50000"/>
-          </a:path>
+          <a:lin ang="5400000" scaled="0"/>
         </a:gradFill>
       </a:bgFillStyleLst>
     </a:fmtScheme>
   </a:themeElements>
-  <a:objectDefaults>
-    <a:spDef>
-      <a:spPr/>
-      <a:bodyPr/>
-      <a:lstStyle/>
-      <a:style>
-        <a:lnRef idx="1">
-          <a:schemeClr val="accent1"/>
-        </a:lnRef>
-        <a:fillRef idx="3">
-          <a:schemeClr val="accent1"/>
-        </a:fillRef>
-        <a:effectRef idx="2">
-          <a:schemeClr val="accent1"/>
-        </a:effectRef>
-        <a:fontRef idx="minor">
-          <a:schemeClr val="lt1"/>
-        </a:fontRef>
-      </a:style>
-    </a:spDef>
-    <a:lnDef>
-      <a:spPr/>
-      <a:bodyPr/>
-      <a:lstStyle/>
-      <a:style>
-        <a:lnRef idx="2">
-          <a:schemeClr val="accent1"/>
-        </a:lnRef>
-        <a:fillRef idx="0">
-          <a:schemeClr val="accent1"/>
-        </a:fillRef>
-        <a:effectRef idx="1">
-          <a:schemeClr val="accent1"/>
-        </a:effectRef>
-        <a:fontRef idx="minor">
-          <a:schemeClr val="tx1"/>
-        </a:fontRef>
-      </a:style>
-    </a:lnDef>
-  </a:objectDefaults>
+  <a:objectDefaults/>
   <a:extraClrSchemeLst/>
+  <a:extLst>
+    <a:ext uri="{05A4C25C-085E-4340-85A3-A5531E510DB2}">
+      <thm15:themeFamily xmlns:thm15="http://schemas.microsoft.com/office/thememl/2012/main" name="Office Theme" id="{2E142A2C-CD16-42D6-873A-C26D2A0506FA}" vid="{1BDDFF52-6CD6-40A5-AB3C-68EB2F1E4D0A}"/>
+    </a:ext>
+  </a:extLst>
 </a:theme>
 </file>
</xml_diff>

<commit_message>
fix: correct Living Evidence claims and resume artifacts (#224)
* fix: correct Living Evidence claims and review gaps

* fix: repair canonical resume artifacts

* chore: sync merged LAVREA snapshot

* test: satisfy strict sketch mock typing

* fix: close artifact and sync review gaps

* fix: preserve unselected visual direction state
</commit_message>
<xml_diff>
--- a/public/resume/Anthony_James_Padavano_CV.docx
+++ b/public/resume/Anthony_James_Padavano_CV.docx
@@ -13,11 +13,11 @@
     </w:p>
     <w:p>
       <w:pPr>
+        <w:pStyle w:val="Compact"/>
         <w:numPr>
           <w:ilvl w:val="0"/>
           <w:numId w:val="1001"/>
         </w:numPr>
-        <w:pStyle w:val="Compact"/>
       </w:pPr>
       <w:r>
         <w:t xml:space="preserve">Email:</w:t>
@@ -26,57 +26,33 @@
         <w:t xml:space="preserve"> </w:t>
       </w:r>
       <w:hyperlink r:id="rId20">
-        <w:r>
-          <w:rPr>
-            <w:rStyle w:val="Hyperlink"/>
-          </w:rPr>
-          <w:t xml:space="preserve">[</w:t>
-        </w:r>
-        <w:r>
-          <w:rPr>
-            <w:rStyle w:val="Hyperlink"/>
-          </w:rPr>
-          <w:t xml:space="preserve">‘</w:t>
-        </w:r>
         <w:r>
           <w:rPr>
             <w:rStyle w:val="Hyperlink"/>
           </w:rPr>
           <w:t xml:space="preserve">padavano.anthony@gmail.com</w:t>
         </w:r>
-        <w:r>
-          <w:rPr>
-            <w:rStyle w:val="Hyperlink"/>
-          </w:rPr>
-          <w:t xml:space="preserve">’</w:t>
-        </w:r>
-        <w:r>
-          <w:rPr>
-            <w:rStyle w:val="Hyperlink"/>
-          </w:rPr>
-          <w:t xml:space="preserve">]</w:t>
-        </w:r>
       </w:hyperlink>
     </w:p>
     <w:p>
       <w:pPr>
+        <w:pStyle w:val="Compact"/>
         <w:numPr>
           <w:ilvl w:val="0"/>
           <w:numId w:val="1001"/>
         </w:numPr>
+      </w:pPr>
+      <w:r>
+        <w:t xml:space="preserve">Location: New York City</w:t>
+      </w:r>
+    </w:p>
+    <w:p>
+      <w:pPr>
         <w:pStyle w:val="Compact"/>
-      </w:pPr>
-      <w:r>
-        <w:t xml:space="preserve">Location: New York City</w:t>
-      </w:r>
-    </w:p>
-    <w:p>
-      <w:pPr>
         <w:numPr>
           <w:ilvl w:val="0"/>
           <w:numId w:val="1001"/>
         </w:numPr>
-        <w:pStyle w:val="Compact"/>
       </w:pPr>
       <w:r>
         <w:t xml:space="preserve">Website:</w:t>
@@ -89,41 +65,17 @@
           <w:rPr>
             <w:rStyle w:val="Hyperlink"/>
           </w:rPr>
-          <w:t xml:space="preserve">[HttpUrl(</w:t>
-        </w:r>
-        <w:r>
-          <w:rPr>
-            <w:rStyle w:val="Hyperlink"/>
-          </w:rPr>
-          <w:t xml:space="preserve">‘</w:t>
-        </w:r>
-        <w:r>
-          <w:rPr>
-            <w:rStyle w:val="Hyperlink"/>
-          </w:rPr>
-          <w:t xml:space="preserve">organvm-vii-kerygma.github.ioportfolio</w:t>
-        </w:r>
-        <w:r>
-          <w:rPr>
-            <w:rStyle w:val="Hyperlink"/>
-          </w:rPr>
-          <w:t xml:space="preserve">’</w:t>
-        </w:r>
-        <w:r>
-          <w:rPr>
-            <w:rStyle w:val="Hyperlink"/>
-          </w:rPr>
-          <w:t xml:space="preserve">)]</w:t>
+          <w:t xml:space="preserve">https://organvm-vii-kerygma.github.io/portfolio/</w:t>
         </w:r>
       </w:hyperlink>
     </w:p>
     <w:p>
       <w:pPr>
+        <w:pStyle w:val="Compact"/>
         <w:numPr>
           <w:ilvl w:val="0"/>
           <w:numId w:val="1001"/>
         </w:numPr>
-        <w:pStyle w:val="Compact"/>
       </w:pPr>
       <w:r>
         <w:t xml:space="preserve">GitHub:</w:t>
@@ -155,7 +107,7 @@
         <w:pStyle w:val="FirstParagraph"/>
       </w:pPr>
       <w:r>
-        <w:t xml:space="preserve">Creative Multimedia Specialist with 10+ years of experience in viral multimedia storytelling, marketing strategy, and content lifecycle management. Achieved +17.5M views and contributed to $2M in fundraising and revenue across 15 client campaigns (2011–2024). Skilled in cross-platform strategies, UI/UX design, and campaign optimization, driving audience growth by 35% and ROI by 325%. Proven leader in team collaboration and data-driven performance enhancements, delivering innovative solutions that combine creativity and measurable results.</w:t>
+        <w:t xml:space="preserve">I build production systems that solve expensive problems — not demos, but live platforms that are tested, deployed, and running. Backend and platform engineer with a testing-first discipline: I own systems end-to-end across data, infrastructure, AI, and deployment. Sole architect of a 309-repository system across 8 GitHub organizations governed by a self-healing CI/CD fleet. Meta-certified Full-Stack Developer with 12+ years shipping software, infrastructure, and content at scale. Python and TypeScript, end to end.</w:t>
       </w:r>
     </w:p>
     <w:bookmarkEnd w:id="24"/>
@@ -174,16 +126,34 @@
       </w:pPr>
       <w:r>
         <w:rPr>
+          <w:b/>
           <w:bCs/>
+        </w:rPr>
+        <w:t xml:space="preserve">Backend:</w:t>
+      </w:r>
+      <w:r>
+        <w:t xml:space="preserve"> </w:t>
+      </w:r>
+      <w:r>
+        <w:t xml:space="preserve">Python, FastAPI, Fastify, Express, Node.js, PostgreSQL, Redis, REST APIs, event-driven services</w:t>
+      </w:r>
+    </w:p>
+    <w:p>
+      <w:pPr>
+        <w:pStyle w:val="BodyText"/>
+      </w:pPr>
+      <w:r>
+        <w:rPr>
           <w:b/>
+          <w:bCs/>
         </w:rPr>
-        <w:t xml:space="preserve">Storytelling &amp; Content:</w:t>
+        <w:t xml:space="preserve">Infrastructure:</w:t>
       </w:r>
       <w:r>
         <w:t xml:space="preserve"> </w:t>
       </w:r>
       <w:r>
-        <w:t xml:space="preserve">Storytelling, content creation, video production, audio production, visual campaigns, content lifecycle management</w:t>
+        <w:t xml:space="preserve">Docker, Terraform (AWS — multi-AZ RDS, ElastiCache, S3), GitHub Actions CI/CD, Cloudflare Workers, Nginx, GCP</w:t>
       </w:r>
     </w:p>
     <w:p>
@@ -192,16 +162,34 @@
       </w:pPr>
       <w:r>
         <w:rPr>
+          <w:b/>
           <w:bCs/>
+        </w:rPr>
+        <w:t xml:space="preserve">AI / ML:</w:t>
+      </w:r>
+      <w:r>
+        <w:t xml:space="preserve"> </w:t>
+      </w:r>
+      <w:r>
+        <w:t xml:space="preserve">Multi-agent orchestration, Claude Agent SDK, LLM pipelines, model-agnostic (Anthropic/OpenAI/Ollama), vector search (ChromaDB)</w:t>
+      </w:r>
+    </w:p>
+    <w:p>
+      <w:pPr>
+        <w:pStyle w:val="BodyText"/>
+      </w:pPr>
+      <w:r>
+        <w:rPr>
           <w:b/>
+          <w:bCs/>
         </w:rPr>
-        <w:t xml:space="preserve">Digital Marketing:</w:t>
+        <w:t xml:space="preserve">Languages:</w:t>
       </w:r>
       <w:r>
         <w:t xml:space="preserve"> </w:t>
       </w:r>
       <w:r>
-        <w:t xml:space="preserve">Campaign strategy, social media management, SEO optimization, Google Ads, paid media, email marketing</w:t>
+        <w:t xml:space="preserve">Python, TypeScript, JavaScript, Rust, SQL, Bash</w:t>
       </w:r>
     </w:p>
     <w:p>
@@ -210,70 +198,34 @@
       </w:pPr>
       <w:r>
         <w:rPr>
+          <w:b/>
           <w:bCs/>
+        </w:rPr>
+        <w:t xml:space="preserve">Testing &amp; Quality:</w:t>
+      </w:r>
+      <w:r>
+        <w:t xml:space="preserve"> </w:t>
+      </w:r>
+      <w:r>
+        <w:t xml:space="preserve">pytest, Vitest, Jest, TDD, ruff, CodeQL — CI-gated across the fleet</w:t>
+      </w:r>
+    </w:p>
+    <w:p>
+      <w:pPr>
+        <w:pStyle w:val="BodyText"/>
+      </w:pPr>
+      <w:r>
+        <w:rPr>
           <w:b/>
+          <w:bCs/>
         </w:rPr>
-        <w:t xml:space="preserve">Design &amp; UX:</w:t>
+        <w:t xml:space="preserve">Frontend &amp; Tooling:</w:t>
       </w:r>
       <w:r>
         <w:t xml:space="preserve"> </w:t>
       </w:r>
       <w:r>
-        <w:t xml:space="preserve">UI/UX design, WordPress, custom HTML/CSS, responsive design, accessibility, wireframing</w:t>
-      </w:r>
-    </w:p>
-    <w:p>
-      <w:pPr>
-        <w:pStyle w:val="BodyText"/>
-      </w:pPr>
-      <w:r>
-        <w:rPr>
-          <w:bCs/>
-          <w:b/>
-        </w:rPr>
-        <w:t xml:space="preserve">Analytics:</w:t>
-      </w:r>
-      <w:r>
-        <w:t xml:space="preserve"> </w:t>
-      </w:r>
-      <w:r>
-        <w:t xml:space="preserve">Performance analytics, A/B testing, conversion optimization, Google Analytics, reporting dashboards</w:t>
-      </w:r>
-    </w:p>
-    <w:p>
-      <w:pPr>
-        <w:pStyle w:val="BodyText"/>
-      </w:pPr>
-      <w:r>
-        <w:rPr>
-          <w:bCs/>
-          <w:b/>
-        </w:rPr>
-        <w:t xml:space="preserve">Technical:</w:t>
-      </w:r>
-      <w:r>
-        <w:t xml:space="preserve"> </w:t>
-      </w:r>
-      <w:r>
-        <w:t xml:space="preserve">Python, TypeScript, JavaScript, Node.js, React, Astro, GitHub Actions, CI/CD, Docker</w:t>
-      </w:r>
-    </w:p>
-    <w:p>
-      <w:pPr>
-        <w:pStyle w:val="BodyText"/>
-      </w:pPr>
-      <w:r>
-        <w:rPr>
-          <w:bCs/>
-          <w:b/>
-        </w:rPr>
-        <w:t xml:space="preserve">Project Management:</w:t>
-      </w:r>
-      <w:r>
-        <w:t xml:space="preserve"> </w:t>
-      </w:r>
-      <w:r>
-        <w:t xml:space="preserve">Cross-functional team leadership, stakeholder management, Agile/Scrum, resource allocation</w:t>
+        <w:t xml:space="preserve">React, Next.js, Astro, Vite, pnpm monorepos, Zod, YAML/JSON Schema, Git</w:t>
       </w:r>
     </w:p>
     <w:bookmarkEnd w:id="25"/>
@@ -286,17 +238,17 @@
         <w:t xml:space="preserve">selected projects</w:t>
       </w:r>
     </w:p>
-    <w:bookmarkStart w:id="26" w:name="X2461ffb1925457cd434a00e58474c4715e89ad3"/>
+    <w:bookmarkStart w:id="26" w:name="state-public-record-data-platform"/>
     <w:p>
       <w:pPr>
         <w:pStyle w:val="Heading2"/>
       </w:pPr>
       <w:r>
         <w:rPr>
+          <w:b/>
           <w:bCs/>
-          <w:b/>
         </w:rPr>
-        <w:t xml:space="preserve">Forward Funders — Scalable Marketing Overhaul</w:t>
+        <w:t xml:space="preserve">50-State Public-Record Data Platform</w:t>
       </w:r>
     </w:p>
     <w:p>
@@ -304,7 +256,7 @@
         <w:pStyle w:val="FirstParagraph"/>
       </w:pPr>
       <w:r>
-        <w:t xml:space="preserve">Jan 2020</w:t>
+        <w:t xml:space="preserve">2024 — Present</w:t>
       </w:r>
     </w:p>
     <w:p>
@@ -315,7 +267,7 @@
         </w:numPr>
       </w:pPr>
       <w:r>
-        <w:t xml:space="preserve">Transitioned client from in-person cold-calling to fully digital marketing approach</w:t>
+        <w:t xml:space="preserve">Backend platform ingesting public records across all 50 U.S. states — 60+ collection agents, PostgreSQL, deployed on Terraform-provisioned AWS (multi-AZ RDS, Redis/ElastiCache, S3)</w:t>
       </w:r>
     </w:p>
     <w:p>
@@ -326,21 +278,21 @@
         </w:numPr>
       </w:pPr>
       <w:r>
-        <w:t xml:space="preserve">Designed and executed social media and Google Ads campaigns achieving 328% ROI; drove consistent lead generation and scalable growth</w:t>
+        <w:t xml:space="preserve">3,399 passing tests with circuit breakers, rate limiting, and graceful degradation for reliable large-scale collection</w:t>
       </w:r>
     </w:p>
     <w:bookmarkEnd w:id="26"/>
-    <w:bookmarkStart w:id="27" w:name="X0b407bf92b755affe6738bd7b358bafe5a2b9b1"/>
+    <w:bookmarkStart w:id="27" w:name="peer-audited-behavioral-blockchain"/>
     <w:p>
       <w:pPr>
         <w:pStyle w:val="Heading2"/>
       </w:pPr>
       <w:r>
         <w:rPr>
+          <w:b/>
           <w:bCs/>
-          <w:b/>
         </w:rPr>
-        <w:t xml:space="preserve">Boca Ballet Theatre — Nonprofit Digital Transformation</w:t>
+        <w:t xml:space="preserve">Peer-Audited Behavioral Blockchain</w:t>
       </w:r>
     </w:p>
     <w:p>
@@ -348,7 +300,7 @@
         <w:pStyle w:val="FirstParagraph"/>
       </w:pPr>
       <w:r>
-        <w:t xml:space="preserve">Jan 2020</w:t>
+        <w:t xml:space="preserve">2024 — Present</w:t>
       </w:r>
     </w:p>
     <w:p>
@@ -359,7 +311,7 @@
         </w:numPr>
       </w:pPr>
       <w:r>
-        <w:t xml:space="preserve">Rebuilt website and social media channels during COVID-19; managed ad campaigns driving funding and enabling remote performances</w:t>
+        <w:t xml:space="preserve">NestJS + Next.js + React Native + Tauri monorepo with Stripe escrow and a double-entry ledger; SHA-256 hash-chained audit log</w:t>
       </w:r>
     </w:p>
     <w:p>
@@ -370,21 +322,21 @@
         </w:numPr>
       </w:pPr>
       <w:r>
-        <w:t xml:space="preserve">Significantly boosted community engagement and donor contributions during critical period</w:t>
+        <w:t xml:space="preserve">1,107 tests behind CodeQL and CI gates; live pitch surface serving 200 OK</w:t>
       </w:r>
     </w:p>
     <w:bookmarkEnd w:id="27"/>
-    <w:bookmarkStart w:id="28" w:name="X6e29aa465a95fd573700188e7bb6e76bd0a1f8e"/>
+    <w:bookmarkStart w:id="28" w:name="agentic-titan-multi-agent-orchestrator"/>
     <w:p>
       <w:pPr>
         <w:pStyle w:val="Heading2"/>
       </w:pPr>
       <w:r>
         <w:rPr>
+          <w:b/>
           <w:bCs/>
-          <w:b/>
         </w:rPr>
-        <w:t xml:space="preserve">MET4MORFOSES — Multilingual Digital Storytelling</w:t>
+        <w:t xml:space="preserve">Agentic Titan — Multi-Agent Orchestrator</w:t>
       </w:r>
     </w:p>
     <w:p>
@@ -392,7 +344,7 @@
         <w:pStyle w:val="FirstParagraph"/>
       </w:pPr>
       <w:r>
-        <w:t xml:space="preserve">Jan 2022</w:t>
+        <w:t xml:space="preserve">2024 — Present</w:t>
       </w:r>
     </w:p>
     <w:p>
@@ -403,7 +355,7 @@
         </w:numPr>
       </w:pPr>
       <w:r>
-        <w:t xml:space="preserve">Produced interactive multilingual digital content exploring Western and Eastern cultural narratives</w:t>
+        <w:t xml:space="preserve">Model-agnostic orchestration framework coordinating Claude, Codex, and Gemini across 9 self-organizing topologies with a FastAPI control dashboard</w:t>
       </w:r>
     </w:p>
     <w:p>
@@ -414,21 +366,21 @@
         </w:numPr>
       </w:pPr>
       <w:r>
-        <w:t xml:space="preserve">Integrated UI/UX design and cross-platform strategies to engage diverse audiences</w:t>
+        <w:t xml:space="preserve">1,095+ tests; Redis task queuing, Celery workers, Ray Serve deployment</w:t>
       </w:r>
     </w:p>
     <w:bookmarkEnd w:id="28"/>
-    <w:bookmarkStart w:id="29" w:name="amp-lab-media-innovative-media-studies"/>
+    <w:bookmarkStart w:id="29" w:name="limen-self-healing-agent-fleet"/>
     <w:p>
       <w:pPr>
         <w:pStyle w:val="Heading2"/>
       </w:pPr>
       <w:r>
         <w:rPr>
+          <w:b/>
           <w:bCs/>
-          <w:b/>
         </w:rPr>
-        <w:t xml:space="preserve">Amp Lab Media — Innovative Media Studies</w:t>
+        <w:t xml:space="preserve">Limen — Self-Healing Agent Fleet</w:t>
       </w:r>
     </w:p>
     <w:p>
@@ -436,7 +388,7 @@
         <w:pStyle w:val="FirstParagraph"/>
       </w:pPr>
       <w:r>
-        <w:t xml:space="preserve">2019 — Present</w:t>
+        <w:t xml:space="preserve">2024 — Present</w:t>
       </w:r>
     </w:p>
     <w:p>
@@ -447,7 +399,7 @@
         </w:numPr>
       </w:pPr>
       <w:r>
-        <w:t xml:space="preserve">Directed and produced video content for nonprofit YouTube channel featuring Object Lesson series</w:t>
+        <w:t xml:space="preserve">Heartbeat-driven autonomic infrastructure that governs 309 repositories with a 9-rung organ ladder — task intake, dispatch, verification, and merge with near-zero manual upkeep</w:t>
       </w:r>
     </w:p>
     <w:p>
@@ -458,21 +410,21 @@
         </w:numPr>
       </w:pPr>
       <w:r>
-        <w:t xml:space="preserve">Managed full content lifecycle; optimized for audience engagement, increasing reach by 42%</w:t>
+        <w:t xml:space="preserve">Budget-capped, persona-gated task system with a FastAPI/Cloudflare-Worker runtime and GitHub-native storage</w:t>
       </w:r>
     </w:p>
     <w:bookmarkEnd w:id="29"/>
-    <w:bookmarkStart w:id="30" w:name="the-eight-organ-system"/>
+    <w:bookmarkStart w:id="30" w:name="ai-chat-exporter"/>
     <w:p>
       <w:pPr>
         <w:pStyle w:val="Heading2"/>
       </w:pPr>
       <w:r>
         <w:rPr>
+          <w:b/>
           <w:bCs/>
-          <w:b/>
         </w:rPr>
-        <w:t xml:space="preserve">The Eight-Organ System</w:t>
+        <w:t xml:space="preserve">AI Chat Exporter</w:t>
       </w:r>
     </w:p>
     <w:p>
@@ -489,15 +441,25 @@
           <w:ilvl w:val="0"/>
           <w:numId w:val="1006"/>
         </w:numPr>
-        <w:pStyle w:val="Compact"/>
-      </w:pPr>
-      <w:r>
-        <w:t xml:space="preserve">Designed and documented orchestration architecture across 91 repos, 8 orgs, ~386K words — demonstrating content lifecycle management at scale</w:t>
+      </w:pPr>
+      <w:r>
+        <w:t xml:space="preserve">~5,900-line TypeScript tool, 5 export formats, 9-language UI; 170 tests, 549 commits</w:t>
+      </w:r>
+    </w:p>
+    <w:p>
+      <w:pPr>
+        <w:numPr>
+          <w:ilvl w:val="0"/>
+          <w:numId w:val="1006"/>
+        </w:numPr>
+      </w:pPr>
+      <w:r>
+        <w:t xml:space="preserve">Distributed across GreasyFork, GitHub, Docker, and Cloudflare Pages</w:t>
       </w:r>
     </w:p>
     <w:bookmarkEnd w:id="30"/>
     <w:bookmarkEnd w:id="31"/>
-    <w:bookmarkStart w:id="37" w:name="experience"/>
+    <w:bookmarkStart w:id="36" w:name="experience"/>
     <w:p>
       <w:pPr>
         <w:pStyle w:val="Heading1"/>
@@ -506,20 +468,20 @@
         <w:t xml:space="preserve">Experience</w:t>
       </w:r>
     </w:p>
-    <w:bookmarkStart w:id="32" w:name="X18ad37f1806b110a2ad3f4c84d72000a3530cda"/>
+    <w:bookmarkStart w:id="32" w:name="X4ba9f411d250ac65b8f70fe3c9411221fde25c7"/>
     <w:p>
       <w:pPr>
         <w:pStyle w:val="Heading2"/>
       </w:pPr>
       <w:r>
         <w:rPr>
+          <w:b/>
           <w:bCs/>
-          <w:b/>
         </w:rPr>
-        <w:t xml:space="preserve">Miami Dade College Foundation</w:t>
-      </w:r>
-      <w:r>
-        <w:t xml:space="preserve">, Digital Marketing Manager</w:t>
+        <w:t xml:space="preserve">ORGANVM (Independent)</w:t>
+      </w:r>
+      <w:r>
+        <w:t xml:space="preserve">, Software Engineer &amp; Developer-Tools Builder</w:t>
       </w:r>
     </w:p>
     <w:p>
@@ -527,7 +489,7 @@
         <w:pStyle w:val="FirstParagraph"/>
       </w:pPr>
       <w:r>
-        <w:t xml:space="preserve">Miami, FL</w:t>
+        <w:t xml:space="preserve">New York City</w:t>
       </w:r>
     </w:p>
     <w:p>
@@ -535,7 +497,7 @@
         <w:pStyle w:val="BodyText"/>
       </w:pPr>
       <w:r>
-        <w:t xml:space="preserve">2023 – 2024</w:t>
+        <w:t xml:space="preserve">2020 – present</w:t>
       </w:r>
     </w:p>
     <w:p>
@@ -543,7 +505,7 @@
         <w:pStyle w:val="BodyText"/>
       </w:pPr>
       <w:r>
-        <w:t xml:space="preserve">1 year</w:t>
+        <w:t xml:space="preserve">6 years</w:t>
       </w:r>
     </w:p>
     <w:p>
@@ -554,7 +516,7 @@
         </w:numPr>
       </w:pPr>
       <w:r>
-        <w:t xml:space="preserve">Designed and executed targeted digital marketing campaigns, increasing donor engagement by 32% and surpassing fundraising goals</w:t>
+        <w:t xml:space="preserve">Designed and operate a 309-repository production system across 8 GitHub organizations, governed by a self-healing CI/CD fleet with automated dependency validation and promotion state machines</w:t>
       </w:r>
     </w:p>
     <w:p>
@@ -565,7 +527,7 @@
         </w:numPr>
       </w:pPr>
       <w:r>
-        <w:t xml:space="preserve">Produced multimedia storytelling content including videos and social media posts, driving 28% increase in click-through rates</w:t>
+        <w:t xml:space="preserve">Built backend platforms and developer tooling in Python and TypeScript — data pipelines, multi-agent AI orchestration, MCP gateways, and reliable automation — deployed on Docker, Terraform/AWS, and Cloudflare</w:t>
       </w:r>
     </w:p>
     <w:p>
@@ -576,46 +538,24 @@
         </w:numPr>
       </w:pPr>
       <w:r>
-        <w:t xml:space="preserve">Rebuilt and optimized foundation website — 38% traffic growth, 22% improvement in donation conversions</w:t>
-      </w:r>
-    </w:p>
-    <w:p>
-      <w:pPr>
-        <w:numPr>
-          <w:ilvl w:val="0"/>
-          <w:numId w:val="1007"/>
-        </w:numPr>
-      </w:pPr>
-      <w:r>
-        <w:t xml:space="preserve">Developed social media strategy boosting engagement rates across platforms by 23%</w:t>
-      </w:r>
-    </w:p>
-    <w:p>
-      <w:pPr>
-        <w:numPr>
-          <w:ilvl w:val="0"/>
-          <w:numId w:val="1007"/>
-        </w:numPr>
-      </w:pPr>
-      <w:r>
-        <w:t xml:space="preserve">Trained team members on advanced analytics tools, leading to 20% efficiency boost in reporting</w:t>
+        <w:t xml:space="preserve">Testing-first throughout: thousands of automated tests behind GitHub Actions CI gates across the estate</w:t>
       </w:r>
     </w:p>
     <w:bookmarkEnd w:id="32"/>
-    <w:bookmarkStart w:id="33" w:name="ajp-media-arts-multimedia-specialist"/>
+    <w:bookmarkStart w:id="33" w:name="X18ad37f1806b110a2ad3f4c84d72000a3530cda"/>
     <w:p>
       <w:pPr>
         <w:pStyle w:val="Heading2"/>
       </w:pPr>
       <w:r>
         <w:rPr>
+          <w:b/>
           <w:bCs/>
-          <w:b/>
         </w:rPr>
-        <w:t xml:space="preserve">AJP Media Arts</w:t>
-      </w:r>
-      <w:r>
-        <w:t xml:space="preserve">, Multimedia Specialist</w:t>
+        <w:t xml:space="preserve">Miami Dade College Foundation</w:t>
+      </w:r>
+      <w:r>
+        <w:t xml:space="preserve">, Digital Marketing Manager</w:t>
       </w:r>
     </w:p>
     <w:p>
@@ -623,7 +563,7 @@
         <w:pStyle w:val="FirstParagraph"/>
       </w:pPr>
       <w:r>
-        <w:t xml:space="preserve">New York City</w:t>
+        <w:t xml:space="preserve">Miami, FL</w:t>
       </w:r>
     </w:p>
     <w:p>
@@ -631,7 +571,7 @@
         <w:pStyle w:val="BodyText"/>
       </w:pPr>
       <w:r>
-        <w:t xml:space="preserve">2011 – present</w:t>
+        <w:t xml:space="preserve">2023 – 2024</w:t>
       </w:r>
     </w:p>
     <w:p>
@@ -639,79 +579,36 @@
         <w:pStyle w:val="BodyText"/>
       </w:pPr>
       <w:r>
-        <w:t xml:space="preserve">15 years</w:t>
-      </w:r>
-    </w:p>
-    <w:p>
-      <w:pPr>
+        <w:t xml:space="preserve">1 year</w:t>
+      </w:r>
+    </w:p>
+    <w:p>
+      <w:pPr>
+        <w:pStyle w:val="Compact"/>
         <w:numPr>
           <w:ilvl w:val="0"/>
           <w:numId w:val="1008"/>
         </w:numPr>
       </w:pPr>
       <w:r>
-        <w:t xml:space="preserve">Produced engaging video, audio, and visual campaigns achieving 17.5M+ views and contributing to $2M in client fundraising and revenue across 15 clients (2011–2024)</w:t>
-      </w:r>
-    </w:p>
-    <w:p>
-      <w:pPr>
-        <w:numPr>
-          <w:ilvl w:val="0"/>
-          <w:numId w:val="1008"/>
-        </w:numPr>
-      </w:pPr>
-      <w:r>
-        <w:t xml:space="preserve">Developed innovative marketing strategies integrating SEO and paid media — 290% ROI for key campaigns</w:t>
-      </w:r>
-    </w:p>
-    <w:p>
-      <w:pPr>
-        <w:numPr>
-          <w:ilvl w:val="0"/>
-          <w:numId w:val="1008"/>
-        </w:numPr>
-      </w:pPr>
-      <w:r>
-        <w:t xml:space="preserve">Launched and managed client websites using WordPress and custom HTML/CSS — 42% engagement increase, 30% speed improvement</w:t>
-      </w:r>
-    </w:p>
-    <w:p>
-      <w:pPr>
-        <w:numPr>
-          <w:ilvl w:val="0"/>
-          <w:numId w:val="1008"/>
-        </w:numPr>
-      </w:pPr>
-      <w:r>
-        <w:t xml:space="preserve">Conducted A/B testing and performance analysis to optimize campaigns — 27% engagement boost across client portfolios</w:t>
-      </w:r>
-    </w:p>
-    <w:p>
-      <w:pPr>
-        <w:numPr>
-          <w:ilvl w:val="0"/>
-          <w:numId w:val="1008"/>
-        </w:numPr>
-      </w:pPr>
-      <w:r>
-        <w:t xml:space="preserve">Delivered intuitive UI/UX designs for client platforms — 26% satisfaction increase, 35% retention improvement</w:t>
+        <w:t xml:space="preserve">Rebuilt the foundation website and ran data-driven campaigns that increased donor engagement 32% and improved donation conversions</w:t>
       </w:r>
     </w:p>
     <w:bookmarkEnd w:id="33"/>
-    <w:bookmarkStart w:id="34" w:name="X3fb6f109cb8fdccfb4062abc9b6321ccd924934"/>
+    <w:bookmarkStart w:id="34" w:name="X1def6a7547521b0cbc98d957fe815e95b0ec448"/>
     <w:p>
       <w:pPr>
         <w:pStyle w:val="Heading2"/>
       </w:pPr>
       <w:r>
         <w:rPr>
+          <w:b/>
           <w:bCs/>
-          <w:b/>
         </w:rPr>
-        <w:t xml:space="preserve">Miami Dade College, FAU, Nova Southeastern, Keiser, Young Harris College, Tarrant County Community College, Broward College, Palm Beach State College</w:t>
-      </w:r>
-      <w:r>
-        <w:t xml:space="preserve">, Instructor</w:t>
+        <w:t xml:space="preserve">Broward College, FAU, Miami Dade College, Nova Southeastern, Keiser, and others</w:t>
+      </w:r>
+      <w:r>
+        <w:t xml:space="preserve">, Instructor — Composition &amp; Writing</w:t>
       </w:r>
     </w:p>
     <w:p>
@@ -719,7 +616,7 @@
         <w:pStyle w:val="FirstParagraph"/>
       </w:pPr>
       <w:r>
-        <w:t xml:space="preserve">South Florida</w:t>
+        <w:t xml:space="preserve">Remote / South Florida</w:t>
       </w:r>
     </w:p>
     <w:p>
@@ -740,74 +637,31 @@
     </w:p>
     <w:p>
       <w:pPr>
+        <w:pStyle w:val="Compact"/>
         <w:numPr>
           <w:ilvl w:val="0"/>
           <w:numId w:val="1009"/>
         </w:numPr>
       </w:pPr>
       <w:r>
-        <w:t xml:space="preserve">Designed and delivered 100+ composition courses to 2,000+ students — 85% above-average grade achievement</w:t>
-      </w:r>
-    </w:p>
-    <w:p>
-      <w:pPr>
-        <w:numPr>
-          <w:ilvl w:val="0"/>
-          <w:numId w:val="1009"/>
-        </w:numPr>
-      </w:pPr>
-      <w:r>
-        <w:t xml:space="preserve">Applied UX principles to create accessible course materials — 92% student approval rating</w:t>
-      </w:r>
-    </w:p>
-    <w:p>
-      <w:pPr>
-        <w:numPr>
-          <w:ilvl w:val="0"/>
-          <w:numId w:val="1009"/>
-        </w:numPr>
-      </w:pPr>
-      <w:r>
-        <w:t xml:space="preserve">Enhanced lectures with multimedia tools, driving 22% increase in engagement</w:t>
-      </w:r>
-    </w:p>
-    <w:p>
-      <w:pPr>
-        <w:numPr>
-          <w:ilvl w:val="0"/>
-          <w:numId w:val="1009"/>
-        </w:numPr>
-      </w:pPr>
-      <w:r>
-        <w:t xml:space="preserve">Managed course lifecycle from concept to completion — 97% completion rate</w:t>
-      </w:r>
-    </w:p>
-    <w:p>
-      <w:pPr>
-        <w:numPr>
-          <w:ilvl w:val="0"/>
-          <w:numId w:val="1009"/>
-        </w:numPr>
-      </w:pPr>
-      <w:r>
-        <w:t xml:space="preserve">Refined teaching methods using performance analytics — 24% improvement in student retention</w:t>
+        <w:t xml:space="preserve">Designed and taught 100+ college composition courses to 2,000+ students across 8+ institutions; built accessible, analytics-informed curricula</w:t>
       </w:r>
     </w:p>
     <w:bookmarkEnd w:id="34"/>
-    <w:bookmarkStart w:id="35" w:name="independent-creative-technologist"/>
+    <w:bookmarkStart w:id="35" w:name="ajp-media-arts-multimedia-specialist"/>
     <w:p>
       <w:pPr>
         <w:pStyle w:val="Heading2"/>
       </w:pPr>
       <w:r>
         <w:rPr>
+          <w:b/>
           <w:bCs/>
-          <w:b/>
         </w:rPr>
-        <w:t xml:space="preserve">Independent</w:t>
-      </w:r>
-      <w:r>
-        <w:t xml:space="preserve">, Creative Technologist</w:t>
+        <w:t xml:space="preserve">AJP Media Arts</w:t>
+      </w:r>
+      <w:r>
+        <w:t xml:space="preserve">, Multimedia Specialist</w:t>
       </w:r>
     </w:p>
     <w:p>
@@ -823,7 +677,7 @@
         <w:pStyle w:val="BodyText"/>
       </w:pPr>
       <w:r>
-        <w:t xml:space="preserve">2021 – present</w:t>
+        <w:t xml:space="preserve">2011 – 2020</w:t>
       </w:r>
     </w:p>
     <w:p>
@@ -831,136 +685,41 @@
         <w:pStyle w:val="BodyText"/>
       </w:pPr>
       <w:r>
-        <w:t xml:space="preserve">5 years</w:t>
-      </w:r>
-    </w:p>
-    <w:p>
-      <w:pPr>
+        <w:t xml:space="preserve">9 years</w:t>
+      </w:r>
+    </w:p>
+    <w:p>
+      <w:pPr>
+        <w:pStyle w:val="Compact"/>
         <w:numPr>
           <w:ilvl w:val="0"/>
           <w:numId w:val="1010"/>
         </w:numPr>
       </w:pPr>
       <w:r>
-        <w:t xml:space="preserve">Designed and launched eight-organ orchestration system coordinating 91 repos across 8 GitHub organizations with ~386K words of documentation</w:t>
-      </w:r>
-    </w:p>
-    <w:p>
-      <w:pPr>
-        <w:numPr>
-          <w:ilvl w:val="0"/>
-          <w:numId w:val="1010"/>
-        </w:numPr>
-      </w:pPr>
-      <w:r>
-        <w:t xml:space="preserve">Built generative art and music systems, interactive installations, and AI-conductor workflow for human-AI co-creation</w:t>
+        <w:t xml:space="preserve">Produced video, audio, and web campaigns for arts and nonprofit clients — 17.5M+ views and $2M in attributed client fundraising</w:t>
       </w:r>
     </w:p>
     <w:bookmarkEnd w:id="35"/>
-    <w:bookmarkStart w:id="36" w:name="majestic-design-project-manager"/>
+    <w:bookmarkEnd w:id="36"/>
+    <w:bookmarkStart w:id="39" w:name="education"/>
+    <w:p>
+      <w:pPr>
+        <w:pStyle w:val="Heading1"/>
+      </w:pPr>
+      <w:r>
+        <w:t xml:space="preserve">Education</w:t>
+      </w:r>
+    </w:p>
+    <w:bookmarkStart w:id="37" w:name="X2ee197ba801a53bf8ecdd526b7d2b2388b35088"/>
     <w:p>
       <w:pPr>
         <w:pStyle w:val="Heading2"/>
       </w:pPr>
       <w:r>
         <w:rPr>
+          <w:b/>
           <w:bCs/>
-          <w:b/>
-        </w:rPr>
-        <w:t xml:space="preserve">Majestic Design</w:t>
-      </w:r>
-      <w:r>
-        <w:t xml:space="preserve">, Project Manager</w:t>
-      </w:r>
-    </w:p>
-    <w:p>
-      <w:pPr>
-        <w:pStyle w:val="FirstParagraph"/>
-      </w:pPr>
-      <w:r>
-        <w:t xml:space="preserve">New York City</w:t>
-      </w:r>
-    </w:p>
-    <w:p>
-      <w:pPr>
-        <w:pStyle w:val="BodyText"/>
-      </w:pPr>
-      <w:r>
-        <w:t xml:space="preserve">2007 – 2018</w:t>
-      </w:r>
-    </w:p>
-    <w:p>
-      <w:pPr>
-        <w:pStyle w:val="BodyText"/>
-      </w:pPr>
-      <w:r>
-        <w:t xml:space="preserve">11 years</w:t>
-      </w:r>
-    </w:p>
-    <w:p>
-      <w:pPr>
-        <w:numPr>
-          <w:ilvl w:val="0"/>
-          <w:numId w:val="1011"/>
-        </w:numPr>
-      </w:pPr>
-      <w:r>
-        <w:t xml:space="preserve">Led 50 commercial and residential construction projects from concept to completion — 90% on-time, within budget</w:t>
-      </w:r>
-    </w:p>
-    <w:p>
-      <w:pPr>
-        <w:numPr>
-          <w:ilvl w:val="0"/>
-          <w:numId w:val="1011"/>
-        </w:numPr>
-      </w:pPr>
-      <w:r>
-        <w:t xml:space="preserve">Produced project visualizations and promotional materials including 3D renderings and video walkthroughs — 25% increase in repeat business</w:t>
-      </w:r>
-    </w:p>
-    <w:p>
-      <w:pPr>
-        <w:numPr>
-          <w:ilvl w:val="0"/>
-          <w:numId w:val="1011"/>
-        </w:numPr>
-      </w:pPr>
-      <w:r>
-        <w:t xml:space="preserve">Built and maintained strong stakeholder relationships — 88% satisfaction rate</w:t>
-      </w:r>
-    </w:p>
-    <w:p>
-      <w:pPr>
-        <w:numPr>
-          <w:ilvl w:val="0"/>
-          <w:numId w:val="1011"/>
-        </w:numPr>
-      </w:pPr>
-      <w:r>
-        <w:t xml:space="preserve">Implemented risk mitigation strategies reducing project delays by 15%; 93% of projects met or exceeded standards</w:t>
-      </w:r>
-    </w:p>
-    <w:bookmarkEnd w:id="36"/>
-    <w:bookmarkEnd w:id="37"/>
-    <w:bookmarkStart w:id="40" w:name="education"/>
-    <w:p>
-      <w:pPr>
-        <w:pStyle w:val="Heading1"/>
-      </w:pPr>
-      <w:r>
-        <w:t xml:space="preserve">Education</w:t>
-      </w:r>
-    </w:p>
-    <w:bookmarkStart w:id="38" w:name="X2ee197ba801a53bf8ecdd526b7d2b2388b35088"/>
-    <w:p>
-      <w:pPr>
-        <w:pStyle w:val="Heading2"/>
-      </w:pPr>
-      <w:r>
-        <w:rPr>
-          <w:bCs/>
-          <w:b/>
         </w:rPr>
         <w:t xml:space="preserve">Florida Atlantic University</w:t>
       </w:r>
@@ -974,8 +733,8 @@
       </w:pPr>
       <w:r>
         <w:rPr>
+          <w:b/>
           <w:bCs/>
-          <w:b/>
         </w:rPr>
         <w:t xml:space="preserve">M.F.A.</w:t>
       </w:r>
@@ -988,16 +747,16 @@
         <w:t xml:space="preserve">2015 – 2018</w:t>
       </w:r>
     </w:p>
-    <w:bookmarkEnd w:id="38"/>
-    <w:bookmarkStart w:id="39" w:name="X32d25e31eb5063a17b71cab77cbef01f3228272"/>
+    <w:bookmarkEnd w:id="37"/>
+    <w:bookmarkStart w:id="38" w:name="X32d25e31eb5063a17b71cab77cbef01f3228272"/>
     <w:p>
       <w:pPr>
         <w:pStyle w:val="Heading2"/>
       </w:pPr>
       <w:r>
         <w:rPr>
+          <w:b/>
           <w:bCs/>
-          <w:b/>
         </w:rPr>
         <w:t xml:space="preserve">CUNY College of Staten Island</w:t>
       </w:r>
@@ -1011,8 +770,8 @@
       </w:pPr>
       <w:r>
         <w:rPr>
+          <w:b/>
           <w:bCs/>
-          <w:b/>
         </w:rPr>
         <w:t xml:space="preserve">B.A.</w:t>
       </w:r>
@@ -1025,9 +784,9 @@
         <w:t xml:space="preserve">2010 – 2014</w:t>
       </w:r>
     </w:p>
+    <w:bookmarkEnd w:id="38"/>
     <w:bookmarkEnd w:id="39"/>
-    <w:bookmarkEnd w:id="40"/>
-    <w:bookmarkStart w:id="41" w:name="certifications"/>
+    <w:bookmarkStart w:id="40" w:name="certifications"/>
     <w:p>
       <w:pPr>
         <w:pStyle w:val="Heading1"/>
@@ -1042,8 +801,8 @@
       </w:pPr>
       <w:r>
         <w:rPr>
+          <w:b/>
           <w:bCs/>
-          <w:b/>
         </w:rPr>
         <w:t xml:space="preserve">Full-Stack Developer — Meta:</w:t>
       </w:r>
@@ -1051,7 +810,7 @@
         <w:t xml:space="preserve"> </w:t>
       </w:r>
       <w:r>
-        <w:t xml:space="preserve">2023 — 2024</w:t>
+        <w:t xml:space="preserve">2024</w:t>
       </w:r>
     </w:p>
     <w:p>
@@ -1060,8 +819,8 @@
       </w:pPr>
       <w:r>
         <w:rPr>
+          <w:b/>
           <w:bCs/>
-          <w:b/>
         </w:rPr>
         <w:t xml:space="preserve">UX Design — Google:</w:t>
       </w:r>
@@ -1069,7 +828,7 @@
         <w:t xml:space="preserve"> </w:t>
       </w:r>
       <w:r>
-        <w:t xml:space="preserve">2022 — 2023</w:t>
+        <w:t xml:space="preserve">2023</w:t>
       </w:r>
     </w:p>
     <w:p>
@@ -1078,8 +837,8 @@
       </w:pPr>
       <w:r>
         <w:rPr>
+          <w:b/>
           <w:bCs/>
-          <w:b/>
         </w:rPr>
         <w:t xml:space="preserve">Digital Marketing &amp; E-commerce — Google:</w:t>
       </w:r>
@@ -1087,7 +846,7 @@
         <w:t xml:space="preserve"> </w:t>
       </w:r>
       <w:r>
-        <w:t xml:space="preserve">2022 — 2023</w:t>
+        <w:t xml:space="preserve">2023</w:t>
       </w:r>
     </w:p>
     <w:p>
@@ -1096,8 +855,8 @@
       </w:pPr>
       <w:r>
         <w:rPr>
+          <w:b/>
           <w:bCs/>
-          <w:b/>
         </w:rPr>
         <w:t xml:space="preserve">Project Management — Google:</w:t>
       </w:r>
@@ -1105,11 +864,15 @@
         <w:t xml:space="preserve"> </w:t>
       </w:r>
       <w:r>
-        <w:t xml:space="preserve">2022 — 2023</w:t>
-      </w:r>
-    </w:p>
-    <w:bookmarkEnd w:id="41"/>
-    <w:sectPr/>
+        <w:t xml:space="preserve">2023</w:t>
+      </w:r>
+    </w:p>
+    <w:bookmarkEnd w:id="40"/>
+    <w:sectPr>
+      <w:footnotePr>
+        <w:numRestart w:val="eachSect"/>
+      </w:footnotePr>
+    </w:sectPr>
   </w:body>
 </w:document>
 </file>
@@ -1140,14 +903,14 @@
 <file path=word/numbering.xml><?xml version="1.0" encoding="utf-8"?>
 <w:numbering xmlns:w="http://schemas.openxmlformats.org/wordprocessingml/2006/main">
   <w:abstractNum w:abstractNumId="990">
-    <w:nsid w:val="A990"/>
+    <w:nsid w:val="0000A990"/>
     <w:multiLevelType w:val="multilevel"/>
     <w:lvl w:ilvl="0">
       <w:numFmt w:val="bullet"/>
       <w:lvlText w:val=" "/>
       <w:lvlJc w:val="left"/>
       <w:pPr>
-        <w:ind w:left="720" w:hanging="480"/>
+        <w:ind w:left="720" w:hanging="360"/>
       </w:pPr>
     </w:lvl>
     <w:lvl w:ilvl="1">
@@ -1155,7 +918,7 @@
       <w:lvlText w:val=" "/>
       <w:lvlJc w:val="left"/>
       <w:pPr>
-        <w:ind w:left="1440" w:hanging="480"/>
+        <w:ind w:left="1440" w:hanging="360"/>
       </w:pPr>
     </w:lvl>
     <w:lvl w:ilvl="2">
@@ -1163,7 +926,7 @@
       <w:lvlText w:val=" "/>
       <w:lvlJc w:val="left"/>
       <w:pPr>
-        <w:ind w:left="2160" w:hanging="480"/>
+        <w:ind w:left="2160" w:hanging="360"/>
       </w:pPr>
     </w:lvl>
     <w:lvl w:ilvl="3">
@@ -1171,7 +934,7 @@
       <w:lvlText w:val=" "/>
       <w:lvlJc w:val="left"/>
       <w:pPr>
-        <w:ind w:left="2880" w:hanging="480"/>
+        <w:ind w:left="2880" w:hanging="360"/>
       </w:pPr>
     </w:lvl>
     <w:lvl w:ilvl="4">
@@ -1179,7 +942,7 @@
       <w:lvlText w:val=" "/>
       <w:lvlJc w:val="left"/>
       <w:pPr>
-        <w:ind w:left="3600" w:hanging="480"/>
+        <w:ind w:left="3600" w:hanging="360"/>
       </w:pPr>
     </w:lvl>
     <w:lvl w:ilvl="5">
@@ -1187,7 +950,7 @@
       <w:lvlText w:val=" "/>
       <w:lvlJc w:val="left"/>
       <w:pPr>
-        <w:ind w:left="4320" w:hanging="480"/>
+        <w:ind w:left="4320" w:hanging="360"/>
       </w:pPr>
     </w:lvl>
     <w:lvl w:ilvl="6">
@@ -1195,7 +958,7 @@
       <w:lvlText w:val=" "/>
       <w:lvlJc w:val="left"/>
       <w:pPr>
-        <w:ind w:left="5040" w:hanging="480"/>
+        <w:ind w:left="5040" w:hanging="360"/>
       </w:pPr>
     </w:lvl>
     <w:lvl w:ilvl="7">
@@ -1203,7 +966,7 @@
       <w:lvlText w:val=" "/>
       <w:lvlJc w:val="left"/>
       <w:pPr>
-        <w:ind w:left="5760" w:hanging="480"/>
+        <w:ind w:left="5760" w:hanging="360"/>
       </w:pPr>
     </w:lvl>
     <w:lvl w:ilvl="8">
@@ -1211,84 +974,111 @@
       <w:lvlText w:val=" "/>
       <w:lvlJc w:val="left"/>
       <w:pPr>
-        <w:ind w:left="6480" w:hanging="480"/>
+        <w:ind w:left="6480" w:hanging="360"/>
       </w:pPr>
     </w:lvl>
   </w:abstractNum>
   <w:abstractNum w:abstractNumId="991">
-    <w:nsid w:val="A991"/>
+    <w:nsid w:val="0000A991"/>
     <w:multiLevelType w:val="multilevel"/>
     <w:lvl w:ilvl="0">
       <w:numFmt w:val="bullet"/>
-      <w:lvlText w:val="•"/>
+      <w:lvlText w:val=""/>
       <w:lvlJc w:val="left"/>
       <w:pPr>
-        <w:ind w:left="720" w:hanging="480"/>
-      </w:pPr>
+        <w:ind w:left="720" w:hanging="360"/>
+      </w:pPr>
+      <w:rPr>
+        <w:rFonts w:ascii="Symbol" w:hAnsi="Symbol" w:cs="Symbol" w:hint="default"/>
+      </w:rPr>
     </w:lvl>
     <w:lvl w:ilvl="1">
       <w:numFmt w:val="bullet"/>
-      <w:lvlText w:val="–"/>
+      <w:lvlText w:val="o"/>
       <w:lvlJc w:val="left"/>
       <w:pPr>
-        <w:ind w:left="1440" w:hanging="480"/>
-      </w:pPr>
+        <w:ind w:left="1440" w:hanging="360"/>
+      </w:pPr>
+      <w:rPr>
+        <w:rFonts w:ascii="Courier New" w:hAnsi="Courier New" w:cs="Courier New" w:hint="default"/>
+      </w:rPr>
     </w:lvl>
     <w:lvl w:ilvl="2">
       <w:numFmt w:val="bullet"/>
-      <w:lvlText w:val="•"/>
+      <w:lvlText w:val=""/>
       <w:lvlJc w:val="left"/>
       <w:pPr>
-        <w:ind w:left="2160" w:hanging="480"/>
-      </w:pPr>
+        <w:ind w:left="2160" w:hanging="360"/>
+      </w:pPr>
+      <w:rPr>
+        <w:rFonts w:ascii="Wingdings" w:hAnsi="Wingdings" w:cs="Wingdings" w:hint="default"/>
+      </w:rPr>
     </w:lvl>
     <w:lvl w:ilvl="3">
       <w:numFmt w:val="bullet"/>
-      <w:lvlText w:val="–"/>
+      <w:lvlText w:val=""/>
       <w:lvlJc w:val="left"/>
       <w:pPr>
-        <w:ind w:left="2880" w:hanging="480"/>
-      </w:pPr>
+        <w:ind w:left="2880" w:hanging="360"/>
+      </w:pPr>
+      <w:rPr>
+        <w:rFonts w:ascii="Symbol" w:hAnsi="Symbol" w:cs="Symbol" w:hint="default"/>
+      </w:rPr>
     </w:lvl>
     <w:lvl w:ilvl="4">
       <w:numFmt w:val="bullet"/>
-      <w:lvlText w:val="•"/>
+      <w:lvlText w:val="o"/>
       <w:lvlJc w:val="left"/>
       <w:pPr>
-        <w:ind w:left="3600" w:hanging="480"/>
-      </w:pPr>
+        <w:ind w:left="3600" w:hanging="360"/>
+      </w:pPr>
+      <w:rPr>
+        <w:rFonts w:ascii="Courier New" w:hAnsi="Courier New" w:cs="Courier New" w:hint="default"/>
+      </w:rPr>
     </w:lvl>
     <w:lvl w:ilvl="5">
       <w:numFmt w:val="bullet"/>
-      <w:lvlText w:val="–"/>
+      <w:lvlText w:val=""/>
       <w:lvlJc w:val="left"/>
       <w:pPr>
-        <w:ind w:left="4320" w:hanging="480"/>
-      </w:pPr>
+        <w:ind w:left="4320" w:hanging="360"/>
+      </w:pPr>
+      <w:rPr>
+        <w:rFonts w:ascii="Wingdings" w:hAnsi="Wingdings" w:cs="Wingdings" w:hint="default"/>
+      </w:rPr>
     </w:lvl>
     <w:lvl w:ilvl="6">
       <w:numFmt w:val="bullet"/>
-      <w:lvlText w:val="•"/>
+      <w:lvlText w:val=""/>
       <w:lvlJc w:val="left"/>
       <w:pPr>
-        <w:ind w:left="5040" w:hanging="480"/>
-      </w:pPr>
+        <w:ind w:left="5040" w:hanging="360"/>
+      </w:pPr>
+      <w:rPr>
+        <w:rFonts w:ascii="Symbol" w:hAnsi="Symbol" w:cs="Symbol" w:hint="default"/>
+      </w:rPr>
     </w:lvl>
     <w:lvl w:ilvl="7">
       <w:numFmt w:val="bullet"/>
-      <w:lvlText w:val="–"/>
+      <w:lvlText w:val="o"/>
       <w:lvlJc w:val="left"/>
       <w:pPr>
-        <w:ind w:left="5760" w:hanging="480"/>
-      </w:pPr>
+        <w:ind w:left="5760" w:hanging="360"/>
+      </w:pPr>
+      <w:rPr>
+        <w:rFonts w:ascii="Courier New" w:hAnsi="Courier New" w:cs="Courier New" w:hint="default"/>
+      </w:rPr>
     </w:lvl>
     <w:lvl w:ilvl="8">
       <w:numFmt w:val="bullet"/>
-      <w:lvlText w:val="•"/>
+      <w:lvlText w:val=""/>
       <w:lvlJc w:val="left"/>
       <w:pPr>
-        <w:ind w:left="6480" w:hanging="480"/>
-      </w:pPr>
+        <w:ind w:left="6480" w:hanging="360"/>
+      </w:pPr>
+      <w:rPr>
+        <w:rFonts w:ascii="Wingdings" w:hAnsi="Wingdings" w:cs="Wingdings" w:hint="default"/>
+      </w:rPr>
     </w:lvl>
   </w:abstractNum>
   <w:num w:numId="1000">
@@ -1324,9 +1114,6 @@
   <w:num w:numId="1010">
     <w:abstractNumId w:val="991"/>
   </w:num>
-  <w:num w:numId="1011">
-    <w:abstractNumId w:val="991"/>
-  </w:num>
 </w:numbering>
 </file>
 
@@ -1356,10 +1143,10 @@
     <w:name w:val="Body Text"/>
     <w:basedOn w:val="Normal"/>
     <w:link w:val="BodyTextChar"/>
+    <w:qFormat/>
     <w:pPr>
       <w:spacing w:after="180" w:before="180"/>
     </w:pPr>
-    <w:qFormat/>
   </w:style>
   <w:style w:customStyle="1" w:styleId="FirstParagraph" w:type="paragraph">
     <w:name w:val="First Paragraph"/>
@@ -1379,36 +1166,69 @@
     <w:name w:val="Title"/>
     <w:basedOn w:val="Normal"/>
     <w:next w:val="BodyText"/>
-    <w:qFormat/>
-    <w:pPr>
-      <w:keepNext/>
-      <w:keepLines/>
-      <w:spacing w:after="240" w:before="480"/>
+    <w:link w:val="TitleChar"/>
+    <w:uiPriority w:val="10"/>
+    <w:qFormat/>
+    <w:rsid w:val="00A10FD9"/>
+    <w:pPr>
+      <w:spacing w:after="80" w:line="240" w:lineRule="auto"/>
+      <w:contextualSpacing/>
       <w:jc w:val="center"/>
     </w:pPr>
     <w:rPr>
       <w:rFonts w:asciiTheme="majorHAnsi" w:cstheme="majorBidi" w:eastAsiaTheme="majorEastAsia" w:hAnsiTheme="majorHAnsi"/>
-      <w:b/>
-      <w:bCs/>
-      <w:color w:themeColor="accent1" w:themeShade="B5" w:val="345A8A"/>
-      <w:sz w:val="36"/>
-      <w:szCs w:val="36"/>
+      <w:spacing w:val="-10"/>
+      <w:kern w:val="28"/>
+      <w:sz w:val="56"/>
+      <w:szCs w:val="56"/>
+    </w:rPr>
+  </w:style>
+  <w:style w:customStyle="1" w:styleId="TitleChar" w:type="character">
+    <w:name w:val="Title Char"/>
+    <w:basedOn w:val="DefaultParagraphFont"/>
+    <w:link w:val="Title"/>
+    <w:uiPriority w:val="10"/>
+    <w:rsid w:val="00A10FD9"/>
+    <w:rPr>
+      <w:rFonts w:asciiTheme="majorHAnsi" w:cstheme="majorBidi" w:eastAsiaTheme="majorEastAsia" w:hAnsiTheme="majorHAnsi"/>
+      <w:spacing w:val="-10"/>
+      <w:kern w:val="28"/>
+      <w:sz w:val="56"/>
+      <w:szCs w:val="56"/>
     </w:rPr>
   </w:style>
   <w:style w:styleId="Subtitle" w:type="paragraph">
     <w:name w:val="Subtitle"/>
     <w:basedOn w:val="Title"/>
     <w:next w:val="BodyText"/>
-    <w:qFormat/>
-    <w:pPr>
-      <w:keepNext/>
-      <w:keepLines/>
-      <w:spacing w:after="240" w:before="240"/>
-      <w:jc w:val="center"/>
-    </w:pPr>
-    <w:rPr>
-      <w:sz w:val="30"/>
-      <w:szCs w:val="30"/>
+    <w:link w:val="SubtitleChar"/>
+    <w:uiPriority w:val="11"/>
+    <w:qFormat/>
+    <w:rsid w:val="00A10FD9"/>
+    <w:pPr>
+      <w:numPr>
+        <w:ilvl w:val="1"/>
+      </w:numPr>
+    </w:pPr>
+    <w:rPr>
+      <w:rFonts w:cstheme="majorBidi" w:eastAsiaTheme="majorEastAsia"/>
+      <w:spacing w:val="15"/>
+      <w:sz w:val="28"/>
+      <w:szCs w:val="28"/>
+    </w:rPr>
+  </w:style>
+  <w:style w:customStyle="1" w:styleId="SubtitleChar" w:type="character">
+    <w:name w:val="Subtitle Char"/>
+    <w:basedOn w:val="DefaultParagraphFont"/>
+    <w:link w:val="Subtitle"/>
+    <w:uiPriority w:val="11"/>
+    <w:rsid w:val="00A10FD9"/>
+    <w:rPr>
+      <w:rFonts w:cstheme="majorBidi" w:eastAsiaTheme="majorEastAsia"/>
+      <w:color w:themeColor="text1" w:themeTint="A6" w:val="595959"/>
+      <w:spacing w:val="15"/>
+      <w:sz w:val="28"/>
+      <w:szCs w:val="28"/>
     </w:rPr>
   </w:style>
   <w:style w:customStyle="1" w:styleId="Author" w:type="paragraph">
@@ -1439,15 +1259,13 @@
     <w:pPr>
       <w:keepNext/>
       <w:keepLines/>
+      <w:spacing w:after="0" w:before="300"/>
       <w:jc w:val="center"/>
-      <w:spacing w:after="0" w:before="300"/>
-    </w:pPr>
-    <w:rPr>
+    </w:pPr>
+    <w:rPr>
+      <w:b/>
       <w:sz w:val="20"/>
       <w:szCs w:val="20"/>
-      <w:b/>
-      <w:color w:val="345A8A"/>
-      &gt;
     </w:rPr>
   </w:style>
   <w:style w:customStyle="1" w:styleId="Abstract" w:type="paragraph">
@@ -1474,191 +1292,321 @@
     <w:rPr/>
   </w:style>
   <w:style w:styleId="Heading1" w:type="paragraph">
-    <w:name w:val="Heading 1"/>
+    <w:name w:val="heading 1"/>
     <w:basedOn w:val="Normal"/>
     <w:next w:val="BodyText"/>
+    <w:link w:val="Heading1Char"/>
     <w:uiPriority w:val="9"/>
     <w:qFormat/>
+    <w:rsid w:val="00A10FD9"/>
     <w:pPr>
       <w:keepNext/>
       <w:keepLines/>
-      <w:spacing w:after="0" w:before="480"/>
+      <w:spacing w:after="80" w:before="360"/>
       <w:outlineLvl w:val="0"/>
     </w:pPr>
     <w:rPr>
       <w:rFonts w:asciiTheme="majorHAnsi" w:cstheme="majorBidi" w:eastAsiaTheme="majorEastAsia" w:hAnsiTheme="majorHAnsi"/>
-      <w:b/>
-      <w:bCs/>
-      <w:color w:themeColor="accent1" w:val="4F81BD"/>
+      <w:color w:themeColor="accent1" w:themeShade="BF" w:val="0F4761"/>
+      <w:sz w:val="40"/>
+      <w:szCs w:val="40"/>
+    </w:rPr>
+  </w:style>
+  <w:style w:styleId="Heading2" w:type="paragraph">
+    <w:name w:val="heading 2"/>
+    <w:basedOn w:val="Normal"/>
+    <w:next w:val="BodyText"/>
+    <w:link w:val="Heading2Char"/>
+    <w:uiPriority w:val="9"/>
+    <w:semiHidden/>
+    <w:unhideWhenUsed/>
+    <w:qFormat/>
+    <w:rsid w:val="00A10FD9"/>
+    <w:pPr>
+      <w:keepNext/>
+      <w:keepLines/>
+      <w:spacing w:after="80" w:before="160"/>
+      <w:outlineLvl w:val="1"/>
+    </w:pPr>
+    <w:rPr>
+      <w:rFonts w:asciiTheme="majorHAnsi" w:cstheme="majorBidi" w:eastAsiaTheme="majorEastAsia" w:hAnsiTheme="majorHAnsi"/>
+      <w:color w:themeColor="accent1" w:themeShade="BF" w:val="0F4761"/>
       <w:sz w:val="32"/>
       <w:szCs w:val="32"/>
     </w:rPr>
   </w:style>
-  <w:style w:styleId="Heading2" w:type="paragraph">
-    <w:name w:val="Heading 2"/>
+  <w:style w:styleId="Heading3" w:type="paragraph">
+    <w:name w:val="heading 3"/>
     <w:basedOn w:val="Normal"/>
     <w:next w:val="BodyText"/>
+    <w:link w:val="Heading3Char"/>
     <w:uiPriority w:val="9"/>
+    <w:semiHidden/>
     <w:unhideWhenUsed/>
     <w:qFormat/>
+    <w:rsid w:val="00A10FD9"/>
     <w:pPr>
       <w:keepNext/>
       <w:keepLines/>
-      <w:spacing w:after="0" w:before="200"/>
-      <w:outlineLvl w:val="1"/>
-    </w:pPr>
-    <w:rPr>
-      <w:rFonts w:asciiTheme="majorHAnsi" w:cstheme="majorBidi" w:eastAsiaTheme="majorEastAsia" w:hAnsiTheme="majorHAnsi"/>
-      <w:b/>
-      <w:bCs/>
-      <w:color w:themeColor="accent1" w:val="4F81BD"/>
+      <w:spacing w:after="80" w:before="160"/>
+      <w:outlineLvl w:val="2"/>
+    </w:pPr>
+    <w:rPr>
+      <w:rFonts w:cstheme="majorBidi" w:eastAsiaTheme="majorEastAsia"/>
+      <w:color w:themeColor="accent1" w:themeShade="BF" w:val="0F4761"/>
       <w:sz w:val="28"/>
       <w:szCs w:val="28"/>
     </w:rPr>
   </w:style>
-  <w:style w:styleId="Heading3" w:type="paragraph">
-    <w:name w:val="Heading 3"/>
+  <w:style w:styleId="Heading4" w:type="paragraph">
+    <w:name w:val="heading 4"/>
     <w:basedOn w:val="Normal"/>
     <w:next w:val="BodyText"/>
+    <w:link w:val="Heading4Char"/>
     <w:uiPriority w:val="9"/>
+    <w:semiHidden/>
     <w:unhideWhenUsed/>
     <w:qFormat/>
+    <w:rsid w:val="00A10FD9"/>
     <w:pPr>
       <w:keepNext/>
       <w:keepLines/>
-      <w:spacing w:after="0" w:before="200"/>
-      <w:outlineLvl w:val="2"/>
-    </w:pPr>
-    <w:rPr>
-      <w:rFonts w:asciiTheme="majorHAnsi" w:cstheme="majorBidi" w:eastAsiaTheme="majorEastAsia" w:hAnsiTheme="majorHAnsi"/>
-      <w:b/>
-      <w:bCs/>
-      <w:color w:themeColor="accent1" w:val="4F81BD"/>
-      <w:sz w:val="24"/>
-      <w:szCs w:val="24"/>
-    </w:rPr>
-  </w:style>
-  <w:style w:styleId="Heading4" w:type="paragraph">
-    <w:name w:val="Heading 4"/>
+      <w:spacing w:after="40" w:before="80"/>
+      <w:outlineLvl w:val="3"/>
+    </w:pPr>
+    <w:rPr>
+      <w:rFonts w:cstheme="majorBidi" w:eastAsiaTheme="majorEastAsia"/>
+      <w:i/>
+      <w:iCs/>
+      <w:color w:themeColor="accent1" w:themeShade="BF" w:val="0F4761"/>
+    </w:rPr>
+  </w:style>
+  <w:style w:styleId="Heading5" w:type="paragraph">
+    <w:name w:val="heading 5"/>
     <w:basedOn w:val="Normal"/>
     <w:next w:val="BodyText"/>
+    <w:link w:val="Heading5Char"/>
     <w:uiPriority w:val="9"/>
+    <w:semiHidden/>
     <w:unhideWhenUsed/>
     <w:qFormat/>
+    <w:rsid w:val="00A10FD9"/>
     <w:pPr>
       <w:keepNext/>
       <w:keepLines/>
-      <w:spacing w:after="0" w:before="200"/>
-      <w:outlineLvl w:val="3"/>
-    </w:pPr>
-    <w:rPr>
-      <w:rFonts w:asciiTheme="majorHAnsi" w:cstheme="majorBidi" w:eastAsiaTheme="majorEastAsia" w:hAnsiTheme="majorHAnsi"/>
-      <w:i/>
-      <w:bCs/>
-      <w:color w:themeColor="accent1" w:val="4F81BD"/>
-      <w:sz w:val="24"/>
-      <w:szCs w:val="24"/>
-    </w:rPr>
-  </w:style>
-  <w:style w:styleId="Heading5" w:type="paragraph">
-    <w:name w:val="Heading 5"/>
+      <w:spacing w:after="40" w:before="80"/>
+      <w:outlineLvl w:val="4"/>
+    </w:pPr>
+    <w:rPr>
+      <w:rFonts w:cstheme="majorBidi" w:eastAsiaTheme="majorEastAsia"/>
+      <w:color w:themeColor="accent1" w:themeShade="BF" w:val="0F4761"/>
+    </w:rPr>
+  </w:style>
+  <w:style w:styleId="Heading6" w:type="paragraph">
+    <w:name w:val="heading 6"/>
     <w:basedOn w:val="Normal"/>
     <w:next w:val="BodyText"/>
+    <w:link w:val="Heading6Char"/>
     <w:uiPriority w:val="9"/>
+    <w:semiHidden/>
     <w:unhideWhenUsed/>
     <w:qFormat/>
+    <w:rsid w:val="00A10FD9"/>
     <w:pPr>
       <w:keepNext/>
       <w:keepLines/>
-      <w:spacing w:after="0" w:before="200"/>
-      <w:outlineLvl w:val="4"/>
-    </w:pPr>
-    <w:rPr>
-      <w:rFonts w:asciiTheme="majorHAnsi" w:cstheme="majorBidi" w:eastAsiaTheme="majorEastAsia" w:hAnsiTheme="majorHAnsi"/>
+      <w:spacing w:after="0" w:before="40"/>
+      <w:outlineLvl w:val="5"/>
+    </w:pPr>
+    <w:rPr>
+      <w:rFonts w:cstheme="majorBidi" w:eastAsiaTheme="majorEastAsia"/>
+      <w:i/>
       <w:iCs/>
-      <w:color w:themeColor="accent1" w:val="4F81BD"/>
-      <w:sz w:val="24"/>
-      <w:szCs w:val="24"/>
-    </w:rPr>
-  </w:style>
-  <w:style w:styleId="Heading6" w:type="paragraph">
-    <w:name w:val="Heading 6"/>
+      <w:color w:themeColor="text1" w:themeTint="A6" w:val="595959"/>
+    </w:rPr>
+  </w:style>
+  <w:style w:styleId="Heading7" w:type="paragraph">
+    <w:name w:val="heading 7"/>
     <w:basedOn w:val="Normal"/>
     <w:next w:val="BodyText"/>
+    <w:link w:val="Heading7Char"/>
     <w:uiPriority w:val="9"/>
+    <w:semiHidden/>
     <w:unhideWhenUsed/>
     <w:qFormat/>
+    <w:rsid w:val="00A10FD9"/>
     <w:pPr>
       <w:keepNext/>
       <w:keepLines/>
-      <w:spacing w:after="0" w:before="200"/>
-      <w:outlineLvl w:val="5"/>
-    </w:pPr>
-    <w:rPr>
-      <w:rFonts w:asciiTheme="majorHAnsi" w:cstheme="majorBidi" w:eastAsiaTheme="majorEastAsia" w:hAnsiTheme="majorHAnsi"/>
-      <w:color w:themeColor="accent1" w:val="4F81BD"/>
-      <w:sz w:val="24"/>
-      <w:szCs w:val="24"/>
-    </w:rPr>
-  </w:style>
-  <w:style w:styleId="Heading7" w:type="paragraph">
-    <w:name w:val="Heading 7"/>
+      <w:spacing w:after="0" w:before="40"/>
+      <w:outlineLvl w:val="6"/>
+    </w:pPr>
+    <w:rPr>
+      <w:rFonts w:cstheme="majorBidi" w:eastAsiaTheme="majorEastAsia"/>
+      <w:color w:themeColor="text1" w:themeTint="A6" w:val="595959"/>
+    </w:rPr>
+  </w:style>
+  <w:style w:styleId="Heading8" w:type="paragraph">
+    <w:name w:val="heading 8"/>
     <w:basedOn w:val="Normal"/>
     <w:next w:val="BodyText"/>
+    <w:link w:val="Heading8Char"/>
     <w:uiPriority w:val="9"/>
+    <w:semiHidden/>
     <w:unhideWhenUsed/>
     <w:qFormat/>
+    <w:rsid w:val="00A10FD9"/>
     <w:pPr>
       <w:keepNext/>
       <w:keepLines/>
-      <w:spacing w:after="0" w:before="200"/>
-      <w:outlineLvl w:val="6"/>
-    </w:pPr>
-    <w:rPr>
-      <w:rFonts w:asciiTheme="majorHAnsi" w:cstheme="majorBidi" w:eastAsiaTheme="majorEastAsia" w:hAnsiTheme="majorHAnsi"/>
-      <w:color w:themeColor="accent1" w:val="4F81BD"/>
-      <w:sz w:val="24"/>
-      <w:szCs w:val="24"/>
-    </w:rPr>
-  </w:style>
-  <w:style w:styleId="Heading8" w:type="paragraph">
-    <w:name w:val="Heading 8"/>
+      <w:spacing w:after="0"/>
+      <w:outlineLvl w:val="7"/>
+    </w:pPr>
+    <w:rPr>
+      <w:rFonts w:cstheme="majorBidi" w:eastAsiaTheme="majorEastAsia"/>
+      <w:i/>
+      <w:iCs/>
+      <w:color w:themeColor="text1" w:themeTint="D8" w:val="272727"/>
+    </w:rPr>
+  </w:style>
+  <w:style w:styleId="Heading9" w:type="paragraph">
+    <w:name w:val="heading 9"/>
     <w:basedOn w:val="Normal"/>
     <w:next w:val="BodyText"/>
+    <w:link w:val="Heading9Char"/>
     <w:uiPriority w:val="9"/>
+    <w:semiHidden/>
     <w:unhideWhenUsed/>
     <w:qFormat/>
+    <w:rsid w:val="00A10FD9"/>
     <w:pPr>
       <w:keepNext/>
       <w:keepLines/>
-      <w:spacing w:after="0" w:before="200"/>
-      <w:outlineLvl w:val="7"/>
-    </w:pPr>
+      <w:spacing w:after="0"/>
+      <w:outlineLvl w:val="8"/>
+    </w:pPr>
+    <w:rPr>
+      <w:rFonts w:cstheme="majorBidi" w:eastAsiaTheme="majorEastAsia"/>
+      <w:color w:themeColor="text1" w:themeTint="D8" w:val="272727"/>
+    </w:rPr>
+  </w:style>
+  <w:style w:customStyle="1" w:styleId="Heading1Char" w:type="character">
+    <w:name w:val="Heading 1 Char"/>
+    <w:basedOn w:val="DefaultParagraphFont"/>
+    <w:link w:val="Heading1"/>
+    <w:uiPriority w:val="9"/>
+    <w:rsid w:val="00A10FD9"/>
     <w:rPr>
       <w:rFonts w:asciiTheme="majorHAnsi" w:cstheme="majorBidi" w:eastAsiaTheme="majorEastAsia" w:hAnsiTheme="majorHAnsi"/>
-      <w:color w:themeColor="accent1" w:val="4F81BD"/>
-      <w:sz w:val="24"/>
-      <w:szCs w:val="24"/>
-    </w:rPr>
-  </w:style>
-  <w:style w:styleId="Heading9" w:type="paragraph">
-    <w:name w:val="Heading 9"/>
-    <w:basedOn w:val="Normal"/>
-    <w:next w:val="BodyText"/>
+      <w:color w:themeColor="accent1" w:themeShade="BF" w:val="0F4761"/>
+      <w:sz w:val="40"/>
+      <w:szCs w:val="40"/>
+    </w:rPr>
+  </w:style>
+  <w:style w:customStyle="1" w:styleId="Heading2Char" w:type="character">
+    <w:name w:val="Heading 2 Char"/>
+    <w:basedOn w:val="DefaultParagraphFont"/>
+    <w:link w:val="Heading2"/>
     <w:uiPriority w:val="9"/>
-    <w:unhideWhenUsed/>
-    <w:qFormat/>
-    <w:pPr>
-      <w:keepNext/>
-      <w:keepLines/>
-      <w:spacing w:after="0" w:before="200"/>
-      <w:outlineLvl w:val="8"/>
-    </w:pPr>
+    <w:semiHidden/>
+    <w:rsid w:val="00A10FD9"/>
     <w:rPr>
       <w:rFonts w:asciiTheme="majorHAnsi" w:cstheme="majorBidi" w:eastAsiaTheme="majorEastAsia" w:hAnsiTheme="majorHAnsi"/>
-      <w:color w:themeColor="accent1" w:val="4F81BD"/>
-      <w:sz w:val="24"/>
-      <w:szCs w:val="24"/>
+      <w:color w:themeColor="accent1" w:themeShade="BF" w:val="0F4761"/>
+      <w:sz w:val="32"/>
+      <w:szCs w:val="32"/>
+    </w:rPr>
+  </w:style>
+  <w:style w:customStyle="1" w:styleId="Heading3Char" w:type="character">
+    <w:name w:val="Heading 3 Char"/>
+    <w:basedOn w:val="DefaultParagraphFont"/>
+    <w:link w:val="Heading3"/>
+    <w:uiPriority w:val="9"/>
+    <w:semiHidden/>
+    <w:rsid w:val="00A10FD9"/>
+    <w:rPr>
+      <w:rFonts w:cstheme="majorBidi" w:eastAsiaTheme="majorEastAsia"/>
+      <w:color w:themeColor="accent1" w:themeShade="BF" w:val="0F4761"/>
+      <w:sz w:val="28"/>
+      <w:szCs w:val="28"/>
+    </w:rPr>
+  </w:style>
+  <w:style w:customStyle="1" w:styleId="Heading4Char" w:type="character">
+    <w:name w:val="Heading 4 Char"/>
+    <w:basedOn w:val="DefaultParagraphFont"/>
+    <w:link w:val="Heading4"/>
+    <w:uiPriority w:val="9"/>
+    <w:semiHidden/>
+    <w:rsid w:val="00A10FD9"/>
+    <w:rPr>
+      <w:rFonts w:cstheme="majorBidi" w:eastAsiaTheme="majorEastAsia"/>
+      <w:i/>
+      <w:iCs/>
+      <w:color w:themeColor="accent1" w:themeShade="BF" w:val="0F4761"/>
+    </w:rPr>
+  </w:style>
+  <w:style w:customStyle="1" w:styleId="Heading5Char" w:type="character">
+    <w:name w:val="Heading 5 Char"/>
+    <w:basedOn w:val="DefaultParagraphFont"/>
+    <w:link w:val="Heading5"/>
+    <w:uiPriority w:val="9"/>
+    <w:semiHidden/>
+    <w:rsid w:val="00A10FD9"/>
+    <w:rPr>
+      <w:rFonts w:cstheme="majorBidi" w:eastAsiaTheme="majorEastAsia"/>
+      <w:color w:themeColor="accent1" w:themeShade="BF" w:val="0F4761"/>
+    </w:rPr>
+  </w:style>
+  <w:style w:customStyle="1" w:styleId="Heading6Char" w:type="character">
+    <w:name w:val="Heading 6 Char"/>
+    <w:basedOn w:val="DefaultParagraphFont"/>
+    <w:link w:val="Heading6"/>
+    <w:uiPriority w:val="9"/>
+    <w:semiHidden/>
+    <w:rsid w:val="00A10FD9"/>
+    <w:rPr>
+      <w:rFonts w:cstheme="majorBidi" w:eastAsiaTheme="majorEastAsia"/>
+      <w:i/>
+      <w:iCs/>
+      <w:color w:themeColor="text1" w:themeTint="A6" w:val="595959"/>
+    </w:rPr>
+  </w:style>
+  <w:style w:customStyle="1" w:styleId="Heading7Char" w:type="character">
+    <w:name w:val="Heading 7 Char"/>
+    <w:basedOn w:val="DefaultParagraphFont"/>
+    <w:link w:val="Heading7"/>
+    <w:uiPriority w:val="9"/>
+    <w:semiHidden/>
+    <w:rsid w:val="00A10FD9"/>
+    <w:rPr>
+      <w:rFonts w:cstheme="majorBidi" w:eastAsiaTheme="majorEastAsia"/>
+      <w:color w:themeColor="text1" w:themeTint="A6" w:val="595959"/>
+    </w:rPr>
+  </w:style>
+  <w:style w:customStyle="1" w:styleId="Heading8Char" w:type="character">
+    <w:name w:val="Heading 8 Char"/>
+    <w:basedOn w:val="DefaultParagraphFont"/>
+    <w:link w:val="Heading8"/>
+    <w:uiPriority w:val="9"/>
+    <w:semiHidden/>
+    <w:rsid w:val="00A10FD9"/>
+    <w:rPr>
+      <w:rFonts w:cstheme="majorBidi" w:eastAsiaTheme="majorEastAsia"/>
+      <w:i/>
+      <w:iCs/>
+      <w:color w:themeColor="text1" w:themeTint="D8" w:val="272727"/>
+    </w:rPr>
+  </w:style>
+  <w:style w:customStyle="1" w:styleId="Heading9Char" w:type="character">
+    <w:name w:val="Heading 9 Char"/>
+    <w:basedOn w:val="DefaultParagraphFont"/>
+    <w:link w:val="Heading9"/>
+    <w:uiPriority w:val="9"/>
+    <w:semiHidden/>
+    <w:rsid w:val="00A10FD9"/>
+    <w:rPr>
+      <w:rFonts w:cstheme="majorBidi" w:eastAsiaTheme="majorEastAsia"/>
+      <w:color w:themeColor="text1" w:themeTint="D8" w:val="272727"/>
     </w:rPr>
   </w:style>
   <w:style w:styleId="BlockText" w:type="paragraph">
@@ -1680,6 +1628,18 @@
     <w:uiPriority w:val="9"/>
     <w:unhideWhenUsed/>
     <w:qFormat/>
+  </w:style>
+  <w:style w:styleId="FootnoteBlockText" w:type="paragraph">
+    <w:name w:val="Footnote Block Text"/>
+    <w:basedOn w:val="FootnoteText"/>
+    <w:next w:val="FootnoteText"/>
+    <w:uiPriority w:val="9"/>
+    <w:unhideWhenUsed/>
+    <w:qFormat/>
+    <w:pPr>
+      <w:spacing w:after="100" w:before="100"/>
+      <w:ind w:firstLine="0" w:left="480" w:right="480"/>
+    </w:pPr>
   </w:style>
   <w:style w:default="1" w:styleId="DefaultParagraphFont" w:type="character">
     <w:name w:val="Default Paragraph Font"/>
@@ -1710,10 +1670,10 @@
         <w:jc w:val="left"/>
       </w:trPr>
       <w:tcPr>
-        <w:vAlign w:val="bottom"/>
         <w:tcBorders>
           <w:bottom w:val="single"/>
         </w:tcBorders>
+        <w:vAlign w:val="bottom"/>
       </w:tcPr>
     </w:tblStylePr>
   </w:style>
@@ -1828,8 +1788,8 @@
     <w:name w:val="KeywordTok"/>
     <w:basedOn w:val="VerbatimChar"/>
     <w:rPr>
+      <w:b/>
       <w:color w:val="007020"/>
-      <w:b/>
     </w:rPr>
   </w:style>
   <w:style w:type="character" w:customStyle="1" w:styleId="DataTypeTok">
@@ -1906,42 +1866,42 @@
     <w:name w:val="ImportTok"/>
     <w:basedOn w:val="VerbatimChar"/>
     <w:rPr>
+      <w:b/>
       <w:color w:val="008000"/>
-      <w:b/>
     </w:rPr>
   </w:style>
   <w:style w:type="character" w:customStyle="1" w:styleId="CommentTok">
     <w:name w:val="CommentTok"/>
     <w:basedOn w:val="VerbatimChar"/>
     <w:rPr>
+      <w:i/>
       <w:color w:val="60a0b0"/>
-      <w:i/>
     </w:rPr>
   </w:style>
   <w:style w:type="character" w:customStyle="1" w:styleId="DocumentationTok">
     <w:name w:val="DocumentationTok"/>
     <w:basedOn w:val="VerbatimChar"/>
     <w:rPr>
+      <w:i/>
       <w:color w:val="ba2121"/>
-      <w:i/>
     </w:rPr>
   </w:style>
   <w:style w:type="character" w:customStyle="1" w:styleId="AnnotationTok">
     <w:name w:val="AnnotationTok"/>
     <w:basedOn w:val="VerbatimChar"/>
     <w:rPr>
-      <w:color w:val="60a0b0"/>
       <w:b/>
       <w:i/>
+      <w:color w:val="60a0b0"/>
     </w:rPr>
   </w:style>
   <w:style w:type="character" w:customStyle="1" w:styleId="CommentVarTok">
     <w:name w:val="CommentVarTok"/>
     <w:basedOn w:val="VerbatimChar"/>
     <w:rPr>
-      <w:color w:val="60a0b0"/>
       <w:b/>
       <w:i/>
+      <w:color w:val="60a0b0"/>
     </w:rPr>
   </w:style>
   <w:style w:type="character" w:customStyle="1" w:styleId="OtherTok">
@@ -1969,8 +1929,8 @@
     <w:name w:val="ControlFlowTok"/>
     <w:basedOn w:val="VerbatimChar"/>
     <w:rPr>
+      <w:b/>
       <w:color w:val="007020"/>
-      <w:b/>
     </w:rPr>
   </w:style>
   <w:style w:type="character" w:customStyle="1" w:styleId="OperatorTok">
@@ -2015,34 +1975,34 @@
     <w:name w:val="InformationTok"/>
     <w:basedOn w:val="VerbatimChar"/>
     <w:rPr>
-      <w:color w:val="60a0b0"/>
       <w:b/>
       <w:i/>
+      <w:color w:val="60a0b0"/>
     </w:rPr>
   </w:style>
   <w:style w:type="character" w:customStyle="1" w:styleId="WarningTok">
     <w:name w:val="WarningTok"/>
     <w:basedOn w:val="VerbatimChar"/>
     <w:rPr>
-      <w:color w:val="60a0b0"/>
       <w:b/>
       <w:i/>
+      <w:color w:val="60a0b0"/>
     </w:rPr>
   </w:style>
   <w:style w:type="character" w:customStyle="1" w:styleId="AlertTok">
     <w:name w:val="AlertTok"/>
     <w:basedOn w:val="VerbatimChar"/>
     <w:rPr>
+      <w:b/>
       <w:color w:val="ff0000"/>
-      <w:b/>
     </w:rPr>
   </w:style>
   <w:style w:type="character" w:customStyle="1" w:styleId="ErrorTok">
     <w:name w:val="ErrorTok"/>
     <w:basedOn w:val="VerbatimChar"/>
     <w:rPr>
+      <w:b/>
       <w:color w:val="ff0000"/>
-      <w:b/>
     </w:rPr>
   </w:style>
   <w:style w:type="character" w:customStyle="1" w:styleId="NormalTok">
@@ -2064,44 +2024,44 @@
         <a:sysClr val="window" lastClr="FFFFFF"/>
       </a:lt1>
       <a:dk2>
-        <a:srgbClr val="1F497D"/>
+        <a:srgbClr val="0E2841"/>
       </a:dk2>
       <a:lt2>
-        <a:srgbClr val="EEECE1"/>
+        <a:srgbClr val="E8E8E8"/>
       </a:lt2>
       <a:accent1>
-        <a:srgbClr val="4F81BD"/>
+        <a:srgbClr val="156082"/>
       </a:accent1>
       <a:accent2>
-        <a:srgbClr val="C0504D"/>
+        <a:srgbClr val="E97132"/>
       </a:accent2>
       <a:accent3>
-        <a:srgbClr val="9BBB59"/>
+        <a:srgbClr val="196B24"/>
       </a:accent3>
       <a:accent4>
-        <a:srgbClr val="8064A2"/>
+        <a:srgbClr val="0F9ED5"/>
       </a:accent4>
       <a:accent5>
-        <a:srgbClr val="4BACC6"/>
+        <a:srgbClr val="A02B93"/>
       </a:accent5>
       <a:accent6>
-        <a:srgbClr val="F79646"/>
+        <a:srgbClr val="4EA72E"/>
       </a:accent6>
       <a:hlink>
-        <a:srgbClr val="0000FF"/>
+        <a:srgbClr val="467886"/>
       </a:hlink>
       <a:folHlink>
-        <a:srgbClr val="800080"/>
+        <a:srgbClr val="96607D"/>
       </a:folHlink>
     </a:clrScheme>
     <a:fontScheme name="Office">
       <a:majorFont>
-        <a:latin typeface="Calibri"/>
+        <a:latin typeface="Aptos Display" panose="02110004020202020204"/>
         <a:ea typeface=""/>
         <a:cs typeface=""/>
-        <a:font script="Jpan" typeface="ＭＳ ゴシック"/>
+        <a:font script="Jpan" typeface="游ゴシック Light"/>
         <a:font script="Hang" typeface="맑은 고딕"/>
-        <a:font script="Hans" typeface="宋体"/>
+        <a:font script="Hans" typeface="等线 Light"/>
         <a:font script="Hant" typeface="新細明體"/>
         <a:font script="Arab" typeface="Times New Roman"/>
         <a:font script="Hebr" typeface="Times New Roman"/>
@@ -2128,14 +2088,32 @@
         <a:font script="Mong" typeface="Mongolian Baiti"/>
         <a:font script="Viet" typeface="Times New Roman"/>
         <a:font script="Uigh" typeface="Microsoft Uighur"/>
+        <a:font script="Geor" typeface="Sylfaen"/>
+        <a:font script="Armn" typeface="Arial"/>
+        <a:font script="Bugi" typeface="Leelawadee UI"/>
+        <a:font script="Bopo" typeface="Microsoft JhengHei"/>
+        <a:font script="Java" typeface="Javanese Text"/>
+        <a:font script="Lisu" typeface="Segoe UI"/>
+        <a:font script="Mymr" typeface="Myanmar Text"/>
+        <a:font script="Nkoo" typeface="Ebrima"/>
+        <a:font script="Olck" typeface="Nirmala UI"/>
+        <a:font script="Osma" typeface="Ebrima"/>
+        <a:font script="Phag" typeface="Phagspa"/>
+        <a:font script="Syrn" typeface="Estrangelo Edessa"/>
+        <a:font script="Syrj" typeface="Estrangelo Edessa"/>
+        <a:font script="Syre" typeface="Estrangelo Edessa"/>
+        <a:font script="Sora" typeface="Nirmala UI"/>
+        <a:font script="Tale" typeface="Microsoft Tai Le"/>
+        <a:font script="Talu" typeface="Microsoft New Tai Lue"/>
+        <a:font script="Tfng" typeface="Ebrima"/>
       </a:majorFont>
       <a:minorFont>
-        <a:latin typeface="Cambria"/>
+        <a:latin typeface="Aptos" panose="02110004020202020204"/>
         <a:ea typeface=""/>
         <a:cs typeface=""/>
-        <a:font script="Jpan" typeface="ＭＳ 明朝"/>
+        <a:font script="Jpan" typeface="游明朝"/>
         <a:font script="Hang" typeface="맑은 고딕"/>
-        <a:font script="Hans" typeface="宋体"/>
+        <a:font script="Hans" typeface="等线"/>
         <a:font script="Hant" typeface="新細明體"/>
         <a:font script="Arab" typeface="Arial"/>
         <a:font script="Hebr" typeface="Arial"/>
@@ -2162,6 +2140,24 @@
         <a:font script="Mong" typeface="Mongolian Baiti"/>
         <a:font script="Viet" typeface="Arial"/>
         <a:font script="Uigh" typeface="Microsoft Uighur"/>
+        <a:font script="Geor" typeface="Sylfaen"/>
+        <a:font script="Armn" typeface="Arial"/>
+        <a:font script="Bugi" typeface="Leelawadee UI"/>
+        <a:font script="Bopo" typeface="Microsoft JhengHei"/>
+        <a:font script="Java" typeface="Javanese Text"/>
+        <a:font script="Lisu" typeface="Segoe UI"/>
+        <a:font script="Mymr" typeface="Myanmar Text"/>
+        <a:font script="Nkoo" typeface="Ebrima"/>
+        <a:font script="Olck" typeface="Nirmala UI"/>
+        <a:font script="Osma" typeface="Ebrima"/>
+        <a:font script="Phag" typeface="Phagspa"/>
+        <a:font script="Syrn" typeface="Estrangelo Edessa"/>
+        <a:font script="Syrj" typeface="Estrangelo Edessa"/>
+        <a:font script="Syre" typeface="Estrangelo Edessa"/>
+        <a:font script="Sora" typeface="Nirmala UI"/>
+        <a:font script="Tale" typeface="Microsoft Tai Le"/>
+        <a:font script="Talu" typeface="Microsoft New Tai Lue"/>
+        <a:font script="Tfng" typeface="Ebrima"/>
       </a:minorFont>
     </a:fontScheme>
     <a:fmtScheme name="Office">
@@ -2173,200 +2169,141 @@
           <a:gsLst>
             <a:gs pos="0">
               <a:schemeClr val="phClr">
-                <a:tint val="50000"/>
-                <a:satMod val="300000"/>
+                <a:lumMod val="110000"/>
+                <a:satMod val="105000"/>
+                <a:tint val="67000"/>
               </a:schemeClr>
             </a:gs>
-            <a:gs pos="35000">
+            <a:gs pos="50000">
               <a:schemeClr val="phClr">
-                <a:tint val="37000"/>
-                <a:satMod val="300000"/>
+                <a:lumMod val="105000"/>
+                <a:satMod val="103000"/>
+                <a:tint val="73000"/>
               </a:schemeClr>
             </a:gs>
             <a:gs pos="100000">
               <a:schemeClr val="phClr">
-                <a:tint val="15000"/>
-                <a:satMod val="350000"/>
+                <a:lumMod val="105000"/>
+                <a:satMod val="109000"/>
+                <a:tint val="81000"/>
               </a:schemeClr>
             </a:gs>
           </a:gsLst>
-          <a:lin ang="16200000" scaled="1"/>
+          <a:lin ang="5400000" scaled="0"/>
         </a:gradFill>
         <a:gradFill rotWithShape="1">
           <a:gsLst>
             <a:gs pos="0">
               <a:schemeClr val="phClr">
-                <a:tint val="100000"/>
+                <a:satMod val="103000"/>
+                <a:lumMod val="102000"/>
+                <a:tint val="94000"/>
+              </a:schemeClr>
+            </a:gs>
+            <a:gs pos="50000">
+              <a:schemeClr val="phClr">
+                <a:satMod val="110000"/>
+                <a:lumMod val="100000"/>
                 <a:shade val="100000"/>
-                <a:satMod val="130000"/>
               </a:schemeClr>
             </a:gs>
             <a:gs pos="100000">
               <a:schemeClr val="phClr">
-                <a:tint val="50000"/>
-                <a:shade val="100000"/>
-                <a:satMod val="350000"/>
+                <a:lumMod val="99000"/>
+                <a:satMod val="120000"/>
+                <a:shade val="78000"/>
               </a:schemeClr>
             </a:gs>
           </a:gsLst>
-          <a:lin ang="16200000" scaled="0"/>
+          <a:lin ang="5400000" scaled="0"/>
         </a:gradFill>
       </a:fillStyleLst>
       <a:lnStyleLst>
-        <a:ln w="9525" cap="flat" cmpd="sng" algn="ctr">
-          <a:solidFill>
-            <a:schemeClr val="phClr">
-              <a:shade val="95000"/>
-              <a:satMod val="105000"/>
-            </a:schemeClr>
-          </a:solidFill>
-          <a:prstDash val="solid"/>
-        </a:ln>
-        <a:ln w="25400" cap="flat" cmpd="sng" algn="ctr">
+        <a:ln w="6350" cap="flat" cmpd="sng" algn="ctr">
           <a:solidFill>
             <a:schemeClr val="phClr"/>
           </a:solidFill>
           <a:prstDash val="solid"/>
+          <a:miter lim="800000"/>
         </a:ln>
-        <a:ln w="38100" cap="flat" cmpd="sng" algn="ctr">
+        <a:ln w="12700" cap="flat" cmpd="sng" algn="ctr">
           <a:solidFill>
             <a:schemeClr val="phClr"/>
           </a:solidFill>
           <a:prstDash val="solid"/>
+          <a:miter lim="800000"/>
+        </a:ln>
+        <a:ln w="19050" cap="flat" cmpd="sng" algn="ctr">
+          <a:solidFill>
+            <a:schemeClr val="phClr"/>
+          </a:solidFill>
+          <a:prstDash val="solid"/>
+          <a:miter lim="800000"/>
         </a:ln>
       </a:lnStyleLst>
       <a:effectStyleLst>
         <a:effectStyle>
+          <a:effectLst/>
+        </a:effectStyle>
+        <a:effectStyle>
+          <a:effectLst/>
+        </a:effectStyle>
+        <a:effectStyle>
           <a:effectLst>
-            <a:outerShdw blurRad="40000" dist="20000" dir="5400000" rotWithShape="0">
+            <a:outerShdw blurRad="57150" dist="19050" dir="5400000" algn="ctr" rotWithShape="0">
               <a:srgbClr val="000000">
-                <a:alpha val="38000"/>
+                <a:alpha val="63000"/>
               </a:srgbClr>
             </a:outerShdw>
           </a:effectLst>
-        </a:effectStyle>
-        <a:effectStyle>
-          <a:effectLst>
-            <a:outerShdw blurRad="40000" dist="23000" dir="5400000" rotWithShape="0">
-              <a:srgbClr val="000000">
-                <a:alpha val="35000"/>
-              </a:srgbClr>
-            </a:outerShdw>
-          </a:effectLst>
-        </a:effectStyle>
-        <a:effectStyle>
-          <a:effectLst>
-            <a:outerShdw blurRad="40000" dist="23000" dir="5400000" rotWithShape="0">
-              <a:srgbClr val="000000">
-                <a:alpha val="35000"/>
-              </a:srgbClr>
-            </a:outerShdw>
-          </a:effectLst>
-          <a:scene3d>
-            <a:camera prst="orthographicFront">
-              <a:rot lat="0" lon="0" rev="0"/>
-            </a:camera>
-            <a:lightRig rig="threePt" dir="t">
-              <a:rot lat="0" lon="0" rev="1200000"/>
-            </a:lightRig>
-          </a:scene3d>
-          <a:sp3d>
-            <a:bevelT w="63500" h="25400"/>
-          </a:sp3d>
         </a:effectStyle>
       </a:effectStyleLst>
       <a:bgFillStyleLst>
         <a:solidFill>
           <a:schemeClr val="phClr"/>
         </a:solidFill>
+        <a:solidFill>
+          <a:schemeClr val="phClr">
+            <a:tint val="95000"/>
+            <a:satMod val="170000"/>
+          </a:schemeClr>
+        </a:solidFill>
         <a:gradFill rotWithShape="1">
           <a:gsLst>
             <a:gs pos="0">
               <a:schemeClr val="phClr">
-                <a:tint val="40000"/>
-                <a:satMod val="350000"/>
+                <a:tint val="93000"/>
+                <a:satMod val="150000"/>
+                <a:shade val="98000"/>
+                <a:lumMod val="102000"/>
               </a:schemeClr>
             </a:gs>
-            <a:gs pos="40000">
+            <a:gs pos="50000">
               <a:schemeClr val="phClr">
-                <a:tint val="45000"/>
-                <a:shade val="99000"/>
-                <a:satMod val="350000"/>
+                <a:tint val="98000"/>
+                <a:satMod val="130000"/>
+                <a:shade val="90000"/>
+                <a:lumMod val="103000"/>
               </a:schemeClr>
             </a:gs>
             <a:gs pos="100000">
               <a:schemeClr val="phClr">
-                <a:shade val="20000"/>
-                <a:satMod val="255000"/>
+                <a:shade val="63000"/>
+                <a:satMod val="120000"/>
               </a:schemeClr>
             </a:gs>
           </a:gsLst>
-          <a:path path="circle">
-            <a:fillToRect l="50000" t="-80000" r="50000" b="180000"/>
-          </a:path>
-        </a:gradFill>
-        <a:gradFill rotWithShape="1">
-          <a:gsLst>
-            <a:gs pos="0">
-              <a:schemeClr val="phClr">
-                <a:tint val="80000"/>
-                <a:satMod val="300000"/>
-              </a:schemeClr>
-            </a:gs>
-            <a:gs pos="100000">
-              <a:schemeClr val="phClr">
-                <a:shade val="30000"/>
-                <a:satMod val="200000"/>
-              </a:schemeClr>
-            </a:gs>
-          </a:gsLst>
-          <a:path path="circle">
-            <a:fillToRect l="50000" t="50000" r="50000" b="50000"/>
-          </a:path>
+          <a:lin ang="5400000" scaled="0"/>
         </a:gradFill>
       </a:bgFillStyleLst>
     </a:fmtScheme>
   </a:themeElements>
-  <a:objectDefaults>
-    <a:spDef>
-      <a:spPr/>
-      <a:bodyPr/>
-      <a:lstStyle/>
-      <a:style>
-        <a:lnRef idx="1">
-          <a:schemeClr val="accent1"/>
-        </a:lnRef>
-        <a:fillRef idx="3">
-          <a:schemeClr val="accent1"/>
-        </a:fillRef>
-        <a:effectRef idx="2">
-          <a:schemeClr val="accent1"/>
-        </a:effectRef>
-        <a:fontRef idx="minor">
-          <a:schemeClr val="lt1"/>
-        </a:fontRef>
-      </a:style>
-    </a:spDef>
-    <a:lnDef>
-      <a:spPr/>
-      <a:bodyPr/>
-      <a:lstStyle/>
-      <a:style>
-        <a:lnRef idx="2">
-          <a:schemeClr val="accent1"/>
-        </a:lnRef>
-        <a:fillRef idx="0">
-          <a:schemeClr val="accent1"/>
-        </a:fillRef>
-        <a:effectRef idx="1">
-          <a:schemeClr val="accent1"/>
-        </a:effectRef>
-        <a:fontRef idx="minor">
-          <a:schemeClr val="tx1"/>
-        </a:fontRef>
-      </a:style>
-    </a:lnDef>
-  </a:objectDefaults>
+  <a:objectDefaults/>
   <a:extraClrSchemeLst/>
+  <a:extLst>
+    <a:ext uri="{05A4C25C-085E-4340-85A3-A5531E510DB2}">
+      <thm15:themeFamily xmlns:thm15="http://schemas.microsoft.com/office/thememl/2012/main" name="Office Theme" id="{2E142A2C-CD16-42D6-873A-C26D2A0506FA}" vid="{1BDDFF52-6CD6-40A5-AB3C-68EB2F1E4D0A}"/>
+    </a:ext>
+  </a:extLst>
 </a:theme>
 </file>
</xml_diff>